<commit_message>
TST-001 v1.0: Testing Strategy, Step 12 design complete
- Layered data quality, unit, reconciliation and documentation
  gate testing, with planted-defect proof for each control
- Per-domain UAT with independent validators and dual go-live
  sign-off; three environments plus CI
- Reviewed and approved by Nomvula Mahlangu (CDO), 22 Oct 2026
- Adds docs/assumptions-register.md
- Step 12 closes once the documentation gate runs in CI
</commit_message>
<xml_diff>
--- a/docs/12-testing-strategy/RetailSphere_Test_Strategy-001_v1.0.docx
+++ b/docs/12-testing-strategy/RetailSphere_Test_Strategy-001_v1.0.docx
@@ -405,9 +405,281 @@
                 <w:sz w:val="19"/>
                 <w:szCs w:val="19"/>
               </w:rPr>
-              <w:t>1.0</w:t>
-            </w:r>
-            <w:r>
+              <w:t>1.0 - Approved</w:t>
+            </w:r>
+          </w:p>
+        </w:tc>
+      </w:tr>
+      <w:tr>
+        <w:tc>
+          <w:tcPr>
+            <w:tcW w:w="2268" w:type="dxa"/>
+            <w:shd w:val="clear" w:color="auto" w:fill="EEF1F8"/>
+          </w:tcPr>
+          <w:p>
+            <w:pPr>
+              <w:rPr>
+                <w:rFonts w:ascii="Calibri" w:hAnsi="Calibri" w:cs="Calibri"/>
+                <w:b/>
+                <w:bCs/>
+                <w:color w:val="1A2E5A"/>
+                <w:spacing w:val="30"/>
+                <w:sz w:val="18"/>
+                <w:szCs w:val="18"/>
+              </w:rPr>
+            </w:pPr>
+            <w:r>
+              <w:rPr>
+                <w:rFonts w:ascii="Calibri" w:hAnsi="Calibri" w:cs="Calibri"/>
+                <w:b/>
+                <w:bCs/>
+                <w:color w:val="1A2E5A"/>
+                <w:spacing w:val="30"/>
+                <w:sz w:val="18"/>
+                <w:szCs w:val="18"/>
+              </w:rPr>
+              <w:t>Date</w:t>
+            </w:r>
+          </w:p>
+        </w:tc>
+        <w:tc>
+          <w:tcPr>
+            <w:tcW w:w="6804" w:type="dxa"/>
+          </w:tcPr>
+          <w:p>
+            <w:pPr>
+              <w:rPr>
+                <w:rFonts w:ascii="Calibri" w:hAnsi="Calibri" w:cs="Calibri"/>
+                <w:color w:val="1A1A1A"/>
+                <w:spacing w:val="30"/>
+                <w:sz w:val="19"/>
+                <w:szCs w:val="19"/>
+              </w:rPr>
+            </w:pPr>
+            <w:r>
+              <w:rPr>
+                <w:rFonts w:ascii="Calibri" w:hAnsi="Calibri" w:cs="Calibri"/>
+                <w:color w:val="1A1A1A"/>
+                <w:spacing w:val="30"/>
+                <w:sz w:val="19"/>
+                <w:szCs w:val="19"/>
+              </w:rPr>
+              <w:t>22</w:t>
+            </w:r>
+            <w:r>
+              <w:rPr>
+                <w:rFonts w:ascii="Calibri" w:hAnsi="Calibri" w:cs="Calibri"/>
+                <w:color w:val="1A1A1A"/>
+                <w:spacing w:val="30"/>
+                <w:sz w:val="19"/>
+                <w:szCs w:val="19"/>
+              </w:rPr>
+              <w:t xml:space="preserve"> </w:t>
+            </w:r>
+            <w:r>
+              <w:rPr>
+                <w:rFonts w:ascii="Calibri" w:hAnsi="Calibri" w:cs="Calibri"/>
+                <w:color w:val="1A1A1A"/>
+                <w:spacing w:val="30"/>
+                <w:sz w:val="19"/>
+                <w:szCs w:val="19"/>
+              </w:rPr>
+              <w:t>October</w:t>
+            </w:r>
+            <w:r>
+              <w:rPr>
+                <w:rFonts w:ascii="Calibri" w:hAnsi="Calibri" w:cs="Calibri"/>
+                <w:color w:val="1A1A1A"/>
+                <w:spacing w:val="30"/>
+                <w:sz w:val="19"/>
+                <w:szCs w:val="19"/>
+              </w:rPr>
+              <w:t xml:space="preserve"> 2026</w:t>
+            </w:r>
+          </w:p>
+        </w:tc>
+      </w:tr>
+      <w:tr>
+        <w:tc>
+          <w:tcPr>
+            <w:tcW w:w="2268" w:type="dxa"/>
+            <w:shd w:val="clear" w:color="auto" w:fill="EEF1F8"/>
+          </w:tcPr>
+          <w:p>
+            <w:pPr>
+              <w:rPr>
+                <w:rFonts w:ascii="Calibri" w:hAnsi="Calibri" w:cs="Calibri"/>
+                <w:b/>
+                <w:bCs/>
+                <w:color w:val="1A2E5A"/>
+                <w:spacing w:val="30"/>
+                <w:sz w:val="18"/>
+                <w:szCs w:val="18"/>
+              </w:rPr>
+            </w:pPr>
+            <w:r>
+              <w:rPr>
+                <w:rFonts w:ascii="Calibri" w:hAnsi="Calibri" w:cs="Calibri"/>
+                <w:b/>
+                <w:bCs/>
+                <w:color w:val="1A2E5A"/>
+                <w:spacing w:val="30"/>
+                <w:sz w:val="18"/>
+                <w:szCs w:val="18"/>
+              </w:rPr>
+              <w:t>Author</w:t>
+            </w:r>
+          </w:p>
+        </w:tc>
+        <w:tc>
+          <w:tcPr>
+            <w:tcW w:w="6804" w:type="dxa"/>
+          </w:tcPr>
+          <w:p>
+            <w:pPr>
+              <w:rPr>
+                <w:rFonts w:ascii="Calibri" w:hAnsi="Calibri" w:cs="Calibri"/>
+                <w:color w:val="1A1A1A"/>
+                <w:spacing w:val="30"/>
+                <w:sz w:val="19"/>
+                <w:szCs w:val="19"/>
+              </w:rPr>
+            </w:pPr>
+            <w:r>
+              <w:rPr>
+                <w:rFonts w:ascii="Calibri" w:hAnsi="Calibri" w:cs="Calibri"/>
+                <w:color w:val="1A1A1A"/>
+                <w:spacing w:val="30"/>
+                <w:sz w:val="19"/>
+                <w:szCs w:val="19"/>
+              </w:rPr>
+              <w:t>Thozamile Mbalo – Data Solutions Architect</w:t>
+            </w:r>
+          </w:p>
+        </w:tc>
+      </w:tr>
+      <w:tr>
+        <w:tc>
+          <w:tcPr>
+            <w:tcW w:w="2268" w:type="dxa"/>
+            <w:shd w:val="clear" w:color="auto" w:fill="EEF1F8"/>
+          </w:tcPr>
+          <w:p>
+            <w:pPr>
+              <w:rPr>
+                <w:rFonts w:ascii="Calibri" w:hAnsi="Calibri" w:cs="Calibri"/>
+                <w:b/>
+                <w:bCs/>
+                <w:color w:val="1A2E5A"/>
+                <w:spacing w:val="30"/>
+                <w:sz w:val="18"/>
+                <w:szCs w:val="18"/>
+              </w:rPr>
+            </w:pPr>
+            <w:r>
+              <w:rPr>
+                <w:rFonts w:ascii="Calibri" w:hAnsi="Calibri" w:cs="Calibri"/>
+                <w:b/>
+                <w:bCs/>
+                <w:color w:val="1A2E5A"/>
+                <w:spacing w:val="30"/>
+                <w:sz w:val="18"/>
+                <w:szCs w:val="18"/>
+              </w:rPr>
+              <w:t>Reviewed by</w:t>
+            </w:r>
+          </w:p>
+        </w:tc>
+        <w:tc>
+          <w:tcPr>
+            <w:tcW w:w="6804" w:type="dxa"/>
+          </w:tcPr>
+          <w:p>
+            <w:pPr>
+              <w:rPr>
+                <w:rFonts w:ascii="Calibri" w:hAnsi="Calibri" w:cs="Calibri"/>
+                <w:color w:val="1A1A1A"/>
+                <w:spacing w:val="30"/>
+                <w:sz w:val="19"/>
+                <w:szCs w:val="19"/>
+              </w:rPr>
+            </w:pPr>
+            <w:r>
+              <w:rPr>
+                <w:rFonts w:ascii="Calibri" w:hAnsi="Calibri" w:cs="Calibri"/>
+                <w:color w:val="1A1A1A"/>
+                <w:spacing w:val="30"/>
+                <w:sz w:val="19"/>
+                <w:szCs w:val="19"/>
+              </w:rPr>
+              <w:t>Nomvula Mahlangu – Chief Data Officer</w:t>
+            </w:r>
+          </w:p>
+        </w:tc>
+      </w:tr>
+      <w:tr>
+        <w:tc>
+          <w:tcPr>
+            <w:tcW w:w="2268" w:type="dxa"/>
+            <w:shd w:val="clear" w:color="auto" w:fill="EEF1F8"/>
+          </w:tcPr>
+          <w:p>
+            <w:pPr>
+              <w:rPr>
+                <w:rFonts w:ascii="Calibri" w:hAnsi="Calibri" w:cs="Calibri"/>
+                <w:b/>
+                <w:bCs/>
+                <w:color w:val="1A2E5A"/>
+                <w:spacing w:val="30"/>
+                <w:sz w:val="18"/>
+                <w:szCs w:val="18"/>
+              </w:rPr>
+            </w:pPr>
+            <w:r>
+              <w:rPr>
+                <w:rFonts w:ascii="Calibri" w:hAnsi="Calibri" w:cs="Calibri"/>
+                <w:b/>
+                <w:bCs/>
+                <w:color w:val="1A2E5A"/>
+                <w:spacing w:val="30"/>
+                <w:sz w:val="18"/>
+                <w:szCs w:val="18"/>
+              </w:rPr>
+              <w:t>Target Platform</w:t>
+            </w:r>
+            <w:r>
+              <w:rPr>
+                <w:rFonts w:ascii="Calibri" w:hAnsi="Calibri" w:cs="Calibri"/>
+                <w:b/>
+                <w:bCs/>
+                <w:color w:val="1A2E5A"/>
+                <w:spacing w:val="30"/>
+                <w:sz w:val="18"/>
+                <w:szCs w:val="18"/>
+              </w:rPr>
+              <w:t>/</w:t>
+            </w:r>
+            <w:r>
+              <w:rPr>
+                <w:rFonts w:ascii="Calibri" w:hAnsi="Calibri" w:cs="Calibri"/>
+                <w:b/>
+                <w:bCs/>
+                <w:color w:val="1A2E5A"/>
+                <w:spacing w:val="30"/>
+                <w:sz w:val="18"/>
+                <w:szCs w:val="18"/>
+              </w:rPr>
+              <w:t>Tooling</w:t>
+            </w:r>
+          </w:p>
+        </w:tc>
+        <w:tc>
+          <w:tcPr>
+            <w:tcW w:w="6804" w:type="dxa"/>
+            <w:shd w:val="clear" w:color="auto" w:fill="F0FDF4"/>
+          </w:tcPr>
+          <w:p>
+            <w:pPr>
               <w:rPr>
                 <w:rFonts w:ascii="Calibri" w:hAnsi="Calibri" w:cs="Calibri"/>
                 <w:b/>
@@ -417,8 +689,7 @@
                 <w:sz w:val="19"/>
                 <w:szCs w:val="19"/>
               </w:rPr>
-              <w:t xml:space="preserve"> </w:t>
-            </w:r>
+            </w:pPr>
             <w:r>
               <w:rPr>
                 <w:rFonts w:ascii="Calibri" w:hAnsi="Calibri" w:cs="Calibri"/>
@@ -429,7 +700,7 @@
                 <w:sz w:val="19"/>
                 <w:szCs w:val="19"/>
               </w:rPr>
-              <w:t>–</w:t>
+              <w:t xml:space="preserve">dbt </w:t>
             </w:r>
             <w:r>
               <w:rPr>
@@ -441,7 +712,7 @@
                 <w:sz w:val="19"/>
                 <w:szCs w:val="19"/>
               </w:rPr>
-              <w:t xml:space="preserve"> </w:t>
+              <w:t>tests/ Azure Data Factory</w:t>
             </w:r>
             <w:r>
               <w:rPr>
@@ -453,7 +724,7 @@
                 <w:sz w:val="19"/>
                 <w:szCs w:val="19"/>
               </w:rPr>
-              <w:t>Draft, In Progress</w:t>
+              <w:t xml:space="preserve"> / Microsoft Fabric</w:t>
             </w:r>
           </w:p>
         </w:tc>
@@ -486,238 +757,7 @@
                 <w:sz w:val="18"/>
                 <w:szCs w:val="18"/>
               </w:rPr>
-              <w:t>Date</w:t>
-            </w:r>
-          </w:p>
-        </w:tc>
-        <w:tc>
-          <w:tcPr>
-            <w:tcW w:w="6804" w:type="dxa"/>
-          </w:tcPr>
-          <w:p>
-            <w:pPr>
-              <w:rPr>
-                <w:rFonts w:ascii="Calibri" w:hAnsi="Calibri" w:cs="Calibri"/>
-                <w:color w:val="1A1A1A"/>
-                <w:spacing w:val="30"/>
-                <w:sz w:val="19"/>
-                <w:szCs w:val="19"/>
-              </w:rPr>
-            </w:pPr>
-            <w:r>
-              <w:rPr>
-                <w:rFonts w:ascii="Calibri" w:hAnsi="Calibri" w:cs="Calibri"/>
-                <w:color w:val="1A1A1A"/>
-                <w:spacing w:val="30"/>
-                <w:sz w:val="19"/>
-                <w:szCs w:val="19"/>
-              </w:rPr>
-              <w:t>22</w:t>
-            </w:r>
-            <w:r>
-              <w:rPr>
-                <w:rFonts w:ascii="Calibri" w:hAnsi="Calibri" w:cs="Calibri"/>
-                <w:color w:val="1A1A1A"/>
-                <w:spacing w:val="30"/>
-                <w:sz w:val="19"/>
-                <w:szCs w:val="19"/>
-              </w:rPr>
-              <w:t xml:space="preserve"> </w:t>
-            </w:r>
-            <w:r>
-              <w:rPr>
-                <w:rFonts w:ascii="Calibri" w:hAnsi="Calibri" w:cs="Calibri"/>
-                <w:color w:val="1A1A1A"/>
-                <w:spacing w:val="30"/>
-                <w:sz w:val="19"/>
-                <w:szCs w:val="19"/>
-              </w:rPr>
-              <w:t>September</w:t>
-            </w:r>
-            <w:r>
-              <w:rPr>
-                <w:rFonts w:ascii="Calibri" w:hAnsi="Calibri" w:cs="Calibri"/>
-                <w:color w:val="1A1A1A"/>
-                <w:spacing w:val="30"/>
-                <w:sz w:val="19"/>
-                <w:szCs w:val="19"/>
-              </w:rPr>
-              <w:t xml:space="preserve"> 2026</w:t>
-            </w:r>
-          </w:p>
-        </w:tc>
-      </w:tr>
-      <w:tr>
-        <w:tc>
-          <w:tcPr>
-            <w:tcW w:w="2268" w:type="dxa"/>
-            <w:shd w:val="clear" w:color="auto" w:fill="EEF1F8"/>
-          </w:tcPr>
-          <w:p>
-            <w:pPr>
-              <w:rPr>
-                <w:rFonts w:ascii="Calibri" w:hAnsi="Calibri" w:cs="Calibri"/>
-                <w:b/>
-                <w:bCs/>
-                <w:color w:val="1A2E5A"/>
-                <w:spacing w:val="30"/>
-                <w:sz w:val="18"/>
-                <w:szCs w:val="18"/>
-              </w:rPr>
-            </w:pPr>
-            <w:r>
-              <w:rPr>
-                <w:rFonts w:ascii="Calibri" w:hAnsi="Calibri" w:cs="Calibri"/>
-                <w:b/>
-                <w:bCs/>
-                <w:color w:val="1A2E5A"/>
-                <w:spacing w:val="30"/>
-                <w:sz w:val="18"/>
-                <w:szCs w:val="18"/>
-              </w:rPr>
-              <w:t>Author</w:t>
-            </w:r>
-          </w:p>
-        </w:tc>
-        <w:tc>
-          <w:tcPr>
-            <w:tcW w:w="6804" w:type="dxa"/>
-          </w:tcPr>
-          <w:p>
-            <w:pPr>
-              <w:rPr>
-                <w:rFonts w:ascii="Calibri" w:hAnsi="Calibri" w:cs="Calibri"/>
-                <w:color w:val="1A1A1A"/>
-                <w:spacing w:val="30"/>
-                <w:sz w:val="19"/>
-                <w:szCs w:val="19"/>
-              </w:rPr>
-            </w:pPr>
-            <w:r>
-              <w:rPr>
-                <w:rFonts w:ascii="Calibri" w:hAnsi="Calibri" w:cs="Calibri"/>
-                <w:color w:val="1A1A1A"/>
-                <w:spacing w:val="30"/>
-                <w:sz w:val="19"/>
-                <w:szCs w:val="19"/>
-              </w:rPr>
-              <w:t>Thozamile Mbalo – Data Solutions Architect</w:t>
-            </w:r>
-          </w:p>
-        </w:tc>
-      </w:tr>
-      <w:tr>
-        <w:tc>
-          <w:tcPr>
-            <w:tcW w:w="2268" w:type="dxa"/>
-            <w:shd w:val="clear" w:color="auto" w:fill="EEF1F8"/>
-          </w:tcPr>
-          <w:p>
-            <w:pPr>
-              <w:rPr>
-                <w:rFonts w:ascii="Calibri" w:hAnsi="Calibri" w:cs="Calibri"/>
-                <w:b/>
-                <w:bCs/>
-                <w:color w:val="1A2E5A"/>
-                <w:spacing w:val="30"/>
-                <w:sz w:val="18"/>
-                <w:szCs w:val="18"/>
-              </w:rPr>
-            </w:pPr>
-            <w:r>
-              <w:rPr>
-                <w:rFonts w:ascii="Calibri" w:hAnsi="Calibri" w:cs="Calibri"/>
-                <w:b/>
-                <w:bCs/>
-                <w:color w:val="1A2E5A"/>
-                <w:spacing w:val="30"/>
-                <w:sz w:val="18"/>
-                <w:szCs w:val="18"/>
-              </w:rPr>
-              <w:t>Reviewed by</w:t>
-            </w:r>
-          </w:p>
-        </w:tc>
-        <w:tc>
-          <w:tcPr>
-            <w:tcW w:w="6804" w:type="dxa"/>
-          </w:tcPr>
-          <w:p>
-            <w:pPr>
-              <w:rPr>
-                <w:rFonts w:ascii="Calibri" w:hAnsi="Calibri" w:cs="Calibri"/>
-                <w:color w:val="1A1A1A"/>
-                <w:spacing w:val="30"/>
-                <w:sz w:val="19"/>
-                <w:szCs w:val="19"/>
-              </w:rPr>
-            </w:pPr>
-            <w:r>
-              <w:rPr>
-                <w:rFonts w:ascii="Calibri" w:hAnsi="Calibri" w:cs="Calibri"/>
-                <w:color w:val="1A1A1A"/>
-                <w:spacing w:val="30"/>
-                <w:sz w:val="19"/>
-                <w:szCs w:val="19"/>
-              </w:rPr>
-              <w:t>(pending)</w:t>
-            </w:r>
-          </w:p>
-        </w:tc>
-      </w:tr>
-      <w:tr>
-        <w:tc>
-          <w:tcPr>
-            <w:tcW w:w="2268" w:type="dxa"/>
-            <w:shd w:val="clear" w:color="auto" w:fill="EEF1F8"/>
-          </w:tcPr>
-          <w:p>
-            <w:pPr>
-              <w:rPr>
-                <w:rFonts w:ascii="Calibri" w:hAnsi="Calibri" w:cs="Calibri"/>
-                <w:b/>
-                <w:bCs/>
-                <w:color w:val="1A2E5A"/>
-                <w:spacing w:val="30"/>
-                <w:sz w:val="18"/>
-                <w:szCs w:val="18"/>
-              </w:rPr>
-            </w:pPr>
-            <w:r>
-              <w:rPr>
-                <w:rFonts w:ascii="Calibri" w:hAnsi="Calibri" w:cs="Calibri"/>
-                <w:b/>
-                <w:bCs/>
-                <w:color w:val="1A2E5A"/>
-                <w:spacing w:val="30"/>
-                <w:sz w:val="18"/>
-                <w:szCs w:val="18"/>
-              </w:rPr>
-              <w:t>Target Platform</w:t>
-            </w:r>
-            <w:r>
-              <w:rPr>
-                <w:rFonts w:ascii="Calibri" w:hAnsi="Calibri" w:cs="Calibri"/>
-                <w:b/>
-                <w:bCs/>
-                <w:color w:val="1A2E5A"/>
-                <w:spacing w:val="30"/>
-                <w:sz w:val="18"/>
-                <w:szCs w:val="18"/>
-              </w:rPr>
-              <w:t>/</w:t>
-            </w:r>
-            <w:r>
-              <w:rPr>
-                <w:rFonts w:ascii="Calibri" w:hAnsi="Calibri" w:cs="Calibri"/>
-                <w:b/>
-                <w:bCs/>
-                <w:color w:val="1A2E5A"/>
-                <w:spacing w:val="30"/>
-                <w:sz w:val="18"/>
-                <w:szCs w:val="18"/>
-              </w:rPr>
-              <w:t>Tooling</w:t>
+              <w:t>Status</w:t>
             </w:r>
           </w:p>
         </w:tc>
@@ -728,6 +768,9 @@
           </w:tcPr>
           <w:p>
             <w:pPr>
+              <w:tabs>
+                <w:tab w:val="left" w:pos="2110"/>
+              </w:tabs>
               <w:rPr>
                 <w:rFonts w:ascii="Calibri" w:hAnsi="Calibri" w:cs="Calibri"/>
                 <w:b/>
@@ -748,98 +791,7 @@
                 <w:sz w:val="19"/>
                 <w:szCs w:val="19"/>
               </w:rPr>
-              <w:t xml:space="preserve">dbt </w:t>
-            </w:r>
-            <w:r>
-              <w:rPr>
-                <w:rFonts w:ascii="Calibri" w:hAnsi="Calibri" w:cs="Calibri"/>
-                <w:b/>
-                <w:bCs/>
-                <w:color w:val="166534"/>
-                <w:spacing w:val="30"/>
-                <w:sz w:val="19"/>
-                <w:szCs w:val="19"/>
-              </w:rPr>
-              <w:t>tests/ Azure Data Factory</w:t>
-            </w:r>
-            <w:r>
-              <w:rPr>
-                <w:rFonts w:ascii="Calibri" w:hAnsi="Calibri" w:cs="Calibri"/>
-                <w:b/>
-                <w:bCs/>
-                <w:color w:val="166534"/>
-                <w:spacing w:val="30"/>
-                <w:sz w:val="19"/>
-                <w:szCs w:val="19"/>
-              </w:rPr>
-              <w:t xml:space="preserve"> / Microsoft Fabric</w:t>
-            </w:r>
-          </w:p>
-        </w:tc>
-      </w:tr>
-      <w:tr>
-        <w:tc>
-          <w:tcPr>
-            <w:tcW w:w="2268" w:type="dxa"/>
-            <w:shd w:val="clear" w:color="auto" w:fill="EEF1F8"/>
-          </w:tcPr>
-          <w:p>
-            <w:pPr>
-              <w:rPr>
-                <w:rFonts w:ascii="Calibri" w:hAnsi="Calibri" w:cs="Calibri"/>
-                <w:b/>
-                <w:bCs/>
-                <w:color w:val="1A2E5A"/>
-                <w:spacing w:val="30"/>
-                <w:sz w:val="18"/>
-                <w:szCs w:val="18"/>
-              </w:rPr>
-            </w:pPr>
-            <w:r>
-              <w:rPr>
-                <w:rFonts w:ascii="Calibri" w:hAnsi="Calibri" w:cs="Calibri"/>
-                <w:b/>
-                <w:bCs/>
-                <w:color w:val="1A2E5A"/>
-                <w:spacing w:val="30"/>
-                <w:sz w:val="18"/>
-                <w:szCs w:val="18"/>
-              </w:rPr>
-              <w:t>Status</w:t>
-            </w:r>
-          </w:p>
-        </w:tc>
-        <w:tc>
-          <w:tcPr>
-            <w:tcW w:w="6804" w:type="dxa"/>
-            <w:shd w:val="clear" w:color="auto" w:fill="F0FDF4"/>
-          </w:tcPr>
-          <w:p>
-            <w:pPr>
-              <w:tabs>
-                <w:tab w:val="left" w:pos="2110"/>
-              </w:tabs>
-              <w:rPr>
-                <w:rFonts w:ascii="Calibri" w:hAnsi="Calibri" w:cs="Calibri"/>
-                <w:b/>
-                <w:bCs/>
-                <w:color w:val="166534"/>
-                <w:spacing w:val="30"/>
-                <w:sz w:val="19"/>
-                <w:szCs w:val="19"/>
-              </w:rPr>
-            </w:pPr>
-            <w:r>
-              <w:rPr>
-                <w:rFonts w:ascii="Calibri" w:hAnsi="Calibri" w:cs="Calibri"/>
-                <w:b/>
-                <w:bCs/>
-                <w:color w:val="166534"/>
-                <w:spacing w:val="30"/>
-                <w:sz w:val="19"/>
-                <w:szCs w:val="19"/>
-              </w:rPr>
-              <w:t>Draft – In Progress</w:t>
+              <w:t>Approved</w:t>
             </w:r>
           </w:p>
         </w:tc>
@@ -1187,39 +1139,7 @@
           <w:rFonts w:ascii="Calibri" w:hAnsi="Calibri" w:cs="Calibri"/>
           <w:color w:val="1A1A1A"/>
         </w:rPr>
-        <w:t xml:space="preserve">This document defines RetailSphere's testing approach across unit, integration, reconciliation, and business validation testing. It satisfies FR-CCR-007 — no bad data may silently reach the </w:t>
-      </w:r>
-      <w:proofErr w:type="gramStart"/>
-      <w:r>
-        <w:rPr>
-          <w:rFonts w:ascii="Calibri" w:hAnsi="Calibri" w:cs="Calibri"/>
-          <w:color w:val="1A1A1A"/>
-        </w:rPr>
-        <w:t>Gold</w:t>
-      </w:r>
-      <w:proofErr w:type="gramEnd"/>
-      <w:r>
-        <w:rPr>
-          <w:rFonts w:ascii="Calibri" w:hAnsi="Calibri" w:cs="Calibri"/>
-          <w:color w:val="1A1A1A"/>
-        </w:rPr>
-        <w:t xml:space="preserve"> layer — and formalizes the testing of the automated documentation-completeness gate committed to in MET-001 Section 6, which must be proven working during this step, before Step 14's first </w:t>
-      </w:r>
-      <w:proofErr w:type="gramStart"/>
-      <w:r>
-        <w:rPr>
-          <w:rFonts w:ascii="Calibri" w:hAnsi="Calibri" w:cs="Calibri"/>
-          <w:color w:val="1A1A1A"/>
-        </w:rPr>
-        <w:t>Silver</w:t>
-      </w:r>
-      <w:proofErr w:type="gramEnd"/>
-      <w:r>
-        <w:rPr>
-          <w:rFonts w:ascii="Calibri" w:hAnsi="Calibri" w:cs="Calibri"/>
-          <w:color w:val="1A1A1A"/>
-        </w:rPr>
-        <w:t xml:space="preserve"> model is built.</w:t>
+        <w:t>This document defines RetailSphere's testing approach across unit, integration, reconciliation, and business validation testing. It satisfies FR-CCR-007 — no bad data may silently reach the Gold layer — and formalizes the testing of the automated documentation-completeness gate committed to in MET-001 Section 6, which must be proven working during this step, before Step 14's first Silver model is built.</w:t>
       </w:r>
       <w:r>
         <w:rPr>
@@ -1324,7 +1244,21 @@
           <w:rFonts w:ascii="Calibri" w:hAnsi="Calibri" w:cs="Calibri"/>
           <w:color w:val="1A1A1A"/>
         </w:rPr>
-        <w:t xml:space="preserve"> — it does not itself contain the test code. Actual dbt test implementations, reconciliation scripts, and gate configuration are Step 13+ build artifacts. This mirrors the standard-versus-artifact boundary already established in MET-001: this document is the standard those build-phase artifacts must meet.</w:t>
+        <w:t xml:space="preserve"> — it does not itself contain the test code. </w:t>
+      </w:r>
+      <w:r>
+        <w:rPr>
+          <w:rFonts w:ascii="Calibri" w:hAnsi="Calibri" w:cs="Calibri"/>
+          <w:color w:val="1A1A1A"/>
+        </w:rPr>
+        <w:t>The documentation gate configuration is built in Step 12; the dbt test implementations and reconciliation scripts are Step 13+ build artifacts</w:t>
+      </w:r>
+      <w:r>
+        <w:rPr>
+          <w:rFonts w:ascii="Calibri" w:hAnsi="Calibri" w:cs="Calibri"/>
+          <w:color w:val="1A1A1A"/>
+        </w:rPr>
+        <w:t>. This mirrors the standard-versus-artifact boundary already established in MET-001: this document is the standard those build-phase artifacts must meet.</w:t>
       </w:r>
     </w:p>
     <w:p>
@@ -3792,23 +3726,7 @@
           <w:rFonts w:ascii="Calibri" w:hAnsi="Calibri" w:cs="Calibri"/>
           <w:color w:val="1A1A1A"/>
         </w:rPr>
-        <w:t xml:space="preserve">Every planted defect is detected, halts only the affected domain's </w:t>
-      </w:r>
-      <w:proofErr w:type="gramStart"/>
-      <w:r>
-        <w:rPr>
-          <w:rFonts w:ascii="Calibri" w:hAnsi="Calibri" w:cs="Calibri"/>
-          <w:color w:val="1A1A1A"/>
-        </w:rPr>
-        <w:t>Gold</w:t>
-      </w:r>
-      <w:proofErr w:type="gramEnd"/>
-      <w:r>
-        <w:rPr>
-          <w:rFonts w:ascii="Calibri" w:hAnsi="Calibri" w:cs="Calibri"/>
-          <w:color w:val="1A1A1A"/>
-        </w:rPr>
-        <w:t xml:space="preserve"> load, and raises an alert per DID-001 Section 6. Case 6 passes with zero variance. A deliberate failure in one domain must leave the other five loading normally.</w:t>
+        <w:t>Every planted defect is detected, halts only the affected domain's Gold load, and raises an alert per DID-001 Section 6. Case 6 passes with zero variance. A deliberate failure in one domain must leave the other five loading normally.</w:t>
       </w:r>
     </w:p>
     <w:p>
@@ -3901,28 +3819,904 @@
         <w:rPr>
           <w:rFonts w:ascii="Calibri" w:hAnsi="Calibri" w:cs="Calibri"/>
         </w:rPr>
-        <w:t xml:space="preserve">Every </w:t>
-      </w:r>
-      <w:r>
-        <w:rPr>
-          <w:rFonts w:ascii="Calibri" w:hAnsi="Calibri" w:cs="Calibri"/>
-        </w:rPr>
-        <w:t xml:space="preserve">column across Bronze, Silver, and Gold must carry the following, written into </w:t>
+        <w:t xml:space="preserve">MET-001 </w:t>
+      </w:r>
+      <w:r>
+        <w:rPr>
+          <w:rFonts w:ascii="Calibri" w:hAnsi="Calibri" w:cs="Calibri"/>
+        </w:rPr>
+        <w:t>Section 6 commits RetailSphere to an automated documentation-completeness gate, proven working here in Step 12 before the first Silver model is built in Step 14. As in Section 5, each test plants a defect and confirms the gate fails.</w:t>
+      </w:r>
+    </w:p>
+    <w:p>
+      <w:pPr>
+        <w:tabs>
+          <w:tab w:val="left" w:pos="1791"/>
+        </w:tabs>
+        <w:rPr>
+          <w:rFonts w:ascii="Calibri" w:hAnsi="Calibri" w:cs="Calibri"/>
+        </w:rPr>
+      </w:pPr>
+      <w:r>
+        <w:rPr>
+          <w:rFonts w:ascii="Calibri" w:hAnsi="Calibri" w:cs="Calibri"/>
+          <w:b/>
+          <w:bCs/>
+        </w:rPr>
+        <w:t>Enforcement.</w:t>
+      </w:r>
+      <w:r>
+        <w:rPr>
+          <w:rFonts w:ascii="Calibri" w:hAnsi="Calibri" w:cs="Calibri"/>
+        </w:rPr>
+        <w:t xml:space="preserve"> </w:t>
+      </w:r>
+      <w:r>
+        <w:rPr>
+          <w:rFonts w:ascii="Calibri" w:hAnsi="Calibri" w:cs="Calibri"/>
+        </w:rPr>
+        <w:t>The gate runs as a required CI check on pull requests to main, with branch protection applied to administrators. A pre-commit hook may give early feedback but is not the gate, since it cannot be enforced on every machine. Tool selection and Fabric adapter support are confirmed during setup.</w:t>
+      </w:r>
+    </w:p>
+    <w:tbl>
+      <w:tblPr>
+        <w:tblStyle w:val="TableGrid"/>
+        <w:tblW w:w="0" w:type="auto"/>
+        <w:tblBorders>
+          <w:top w:val="single" w:sz="4" w:space="0" w:color="D0D8EC"/>
+          <w:left w:val="single" w:sz="4" w:space="0" w:color="D0D8EC"/>
+          <w:bottom w:val="single" w:sz="4" w:space="0" w:color="D0D8EC"/>
+          <w:right w:val="single" w:sz="4" w:space="0" w:color="D0D8EC"/>
+          <w:insideH w:val="single" w:sz="4" w:space="0" w:color="D0D8EC"/>
+          <w:insideV w:val="single" w:sz="4" w:space="0" w:color="D0D8EC"/>
+        </w:tblBorders>
+        <w:tblLook w:val="04A0" w:firstRow="1" w:lastRow="0" w:firstColumn="1" w:lastColumn="0" w:noHBand="0" w:noVBand="1"/>
+      </w:tblPr>
+      <w:tblGrid>
+        <w:gridCol w:w="562"/>
+        <w:gridCol w:w="4395"/>
+        <w:gridCol w:w="5499"/>
+      </w:tblGrid>
+      <w:tr>
+        <w:tc>
+          <w:tcPr>
+            <w:tcW w:w="562" w:type="dxa"/>
+            <w:shd w:val="clear" w:color="auto" w:fill="1A2E5A"/>
+          </w:tcPr>
+          <w:p>
+            <w:pPr>
+              <w:tabs>
+                <w:tab w:val="left" w:pos="1791"/>
+              </w:tabs>
+              <w:rPr>
+                <w:rFonts w:ascii="Calibri" w:hAnsi="Calibri" w:cs="Calibri"/>
+                <w:b/>
+                <w:bCs/>
+                <w:sz w:val="20"/>
+                <w:szCs w:val="20"/>
+              </w:rPr>
+            </w:pPr>
+            <w:r>
+              <w:rPr>
+                <w:rFonts w:ascii="Calibri" w:hAnsi="Calibri" w:cs="Calibri"/>
+                <w:b/>
+                <w:bCs/>
+                <w:sz w:val="20"/>
+                <w:szCs w:val="20"/>
+              </w:rPr>
+              <w:t>#</w:t>
+            </w:r>
+          </w:p>
+        </w:tc>
+        <w:tc>
+          <w:tcPr>
+            <w:tcW w:w="4395" w:type="dxa"/>
+            <w:shd w:val="clear" w:color="auto" w:fill="1A2E5A"/>
+          </w:tcPr>
+          <w:p>
+            <w:pPr>
+              <w:tabs>
+                <w:tab w:val="left" w:pos="1791"/>
+              </w:tabs>
+              <w:rPr>
+                <w:rFonts w:ascii="Calibri" w:hAnsi="Calibri" w:cs="Calibri"/>
+                <w:b/>
+                <w:bCs/>
+                <w:sz w:val="20"/>
+                <w:szCs w:val="20"/>
+              </w:rPr>
+            </w:pPr>
+            <w:r>
+              <w:rPr>
+                <w:rFonts w:ascii="Calibri" w:hAnsi="Calibri" w:cs="Calibri"/>
+                <w:b/>
+                <w:bCs/>
+                <w:sz w:val="20"/>
+                <w:szCs w:val="20"/>
+              </w:rPr>
+              <w:t>Planted defect</w:t>
+            </w:r>
+          </w:p>
+        </w:tc>
+        <w:tc>
+          <w:tcPr>
+            <w:tcW w:w="5499" w:type="dxa"/>
+            <w:shd w:val="clear" w:color="auto" w:fill="1A2E5A"/>
+          </w:tcPr>
+          <w:p>
+            <w:pPr>
+              <w:tabs>
+                <w:tab w:val="left" w:pos="1791"/>
+              </w:tabs>
+              <w:rPr>
+                <w:rFonts w:ascii="Calibri" w:hAnsi="Calibri" w:cs="Calibri"/>
+                <w:b/>
+                <w:bCs/>
+                <w:sz w:val="20"/>
+                <w:szCs w:val="20"/>
+              </w:rPr>
+            </w:pPr>
+            <w:r>
+              <w:rPr>
+                <w:rFonts w:ascii="Calibri" w:hAnsi="Calibri" w:cs="Calibri"/>
+                <w:b/>
+                <w:bCs/>
+                <w:sz w:val="20"/>
+                <w:szCs w:val="20"/>
+              </w:rPr>
+              <w:t>Expected results</w:t>
+            </w:r>
+          </w:p>
+        </w:tc>
+      </w:tr>
+      <w:tr>
+        <w:tc>
+          <w:tcPr>
+            <w:tcW w:w="562" w:type="dxa"/>
+          </w:tcPr>
+          <w:p>
+            <w:pPr>
+              <w:tabs>
+                <w:tab w:val="left" w:pos="1791"/>
+              </w:tabs>
+              <w:rPr>
+                <w:rFonts w:ascii="Calibri" w:hAnsi="Calibri" w:cs="Calibri"/>
+                <w:sz w:val="19"/>
+                <w:szCs w:val="19"/>
+              </w:rPr>
+            </w:pPr>
+            <w:r>
+              <w:rPr>
+                <w:rFonts w:ascii="Calibri" w:hAnsi="Calibri" w:cs="Calibri"/>
+                <w:sz w:val="19"/>
+                <w:szCs w:val="19"/>
+              </w:rPr>
+              <w:t>1</w:t>
+            </w:r>
+          </w:p>
+        </w:tc>
+        <w:tc>
+          <w:tcPr>
+            <w:tcW w:w="4395" w:type="dxa"/>
+          </w:tcPr>
+          <w:p>
+            <w:pPr>
+              <w:tabs>
+                <w:tab w:val="left" w:pos="1791"/>
+              </w:tabs>
+              <w:rPr>
+                <w:rFonts w:ascii="Calibri" w:hAnsi="Calibri" w:cs="Calibri"/>
+                <w:sz w:val="19"/>
+                <w:szCs w:val="19"/>
+              </w:rPr>
+            </w:pPr>
+            <w:r>
+              <w:rPr>
+                <w:rFonts w:ascii="Calibri" w:hAnsi="Calibri" w:cs="Calibri"/>
+                <w:sz w:val="19"/>
+                <w:szCs w:val="19"/>
+              </w:rPr>
+              <w:t>Model with no description</w:t>
+            </w:r>
+          </w:p>
+        </w:tc>
+        <w:tc>
+          <w:tcPr>
+            <w:tcW w:w="5499" w:type="dxa"/>
+          </w:tcPr>
+          <w:p>
+            <w:pPr>
+              <w:tabs>
+                <w:tab w:val="left" w:pos="1791"/>
+              </w:tabs>
+              <w:rPr>
+                <w:rFonts w:ascii="Calibri" w:hAnsi="Calibri" w:cs="Calibri"/>
+                <w:sz w:val="19"/>
+                <w:szCs w:val="19"/>
+              </w:rPr>
+            </w:pPr>
+            <w:r>
+              <w:rPr>
+                <w:rFonts w:ascii="Calibri" w:hAnsi="Calibri" w:cs="Calibri"/>
+                <w:sz w:val="19"/>
+                <w:szCs w:val="19"/>
+              </w:rPr>
+              <w:t>Fail</w:t>
+            </w:r>
+          </w:p>
+        </w:tc>
+      </w:tr>
+      <w:tr>
+        <w:tc>
+          <w:tcPr>
+            <w:tcW w:w="562" w:type="dxa"/>
+            <w:shd w:val="clear" w:color="auto" w:fill="EEF1F8"/>
+          </w:tcPr>
+          <w:p>
+            <w:pPr>
+              <w:tabs>
+                <w:tab w:val="left" w:pos="1791"/>
+              </w:tabs>
+              <w:rPr>
+                <w:rFonts w:ascii="Calibri" w:hAnsi="Calibri" w:cs="Calibri"/>
+                <w:sz w:val="19"/>
+                <w:szCs w:val="19"/>
+              </w:rPr>
+            </w:pPr>
+            <w:r>
+              <w:rPr>
+                <w:rFonts w:ascii="Calibri" w:hAnsi="Calibri" w:cs="Calibri"/>
+                <w:sz w:val="19"/>
+                <w:szCs w:val="19"/>
+              </w:rPr>
+              <w:t>2</w:t>
+            </w:r>
+          </w:p>
+        </w:tc>
+        <w:tc>
+          <w:tcPr>
+            <w:tcW w:w="4395" w:type="dxa"/>
+            <w:shd w:val="clear" w:color="auto" w:fill="EEF1F8"/>
+          </w:tcPr>
+          <w:p>
+            <w:pPr>
+              <w:tabs>
+                <w:tab w:val="left" w:pos="1791"/>
+              </w:tabs>
+              <w:rPr>
+                <w:rFonts w:ascii="Calibri" w:hAnsi="Calibri" w:cs="Calibri"/>
+                <w:sz w:val="19"/>
+                <w:szCs w:val="19"/>
+              </w:rPr>
+            </w:pPr>
+            <w:r>
+              <w:rPr>
+                <w:rFonts w:ascii="Calibri" w:hAnsi="Calibri" w:cs="Calibri"/>
+                <w:sz w:val="19"/>
+                <w:szCs w:val="19"/>
+              </w:rPr>
+              <w:t>Declared column with no description</w:t>
+            </w:r>
+          </w:p>
+        </w:tc>
+        <w:tc>
+          <w:tcPr>
+            <w:tcW w:w="5499" w:type="dxa"/>
+            <w:shd w:val="clear" w:color="auto" w:fill="EEF1F8"/>
+          </w:tcPr>
+          <w:p>
+            <w:pPr>
+              <w:tabs>
+                <w:tab w:val="left" w:pos="1791"/>
+              </w:tabs>
+              <w:rPr>
+                <w:rFonts w:ascii="Calibri" w:hAnsi="Calibri" w:cs="Calibri"/>
+                <w:sz w:val="19"/>
+                <w:szCs w:val="19"/>
+              </w:rPr>
+            </w:pPr>
+            <w:r>
+              <w:rPr>
+                <w:rFonts w:ascii="Calibri" w:hAnsi="Calibri" w:cs="Calibri"/>
+                <w:sz w:val="19"/>
+                <w:szCs w:val="19"/>
+              </w:rPr>
+              <w:t>Fail</w:t>
+            </w:r>
+          </w:p>
+        </w:tc>
+      </w:tr>
+      <w:tr>
+        <w:tc>
+          <w:tcPr>
+            <w:tcW w:w="562" w:type="dxa"/>
+          </w:tcPr>
+          <w:p>
+            <w:pPr>
+              <w:tabs>
+                <w:tab w:val="left" w:pos="1791"/>
+              </w:tabs>
+              <w:rPr>
+                <w:rFonts w:ascii="Calibri" w:hAnsi="Calibri" w:cs="Calibri"/>
+                <w:sz w:val="19"/>
+                <w:szCs w:val="19"/>
+              </w:rPr>
+            </w:pPr>
+            <w:r>
+              <w:rPr>
+                <w:rFonts w:ascii="Calibri" w:hAnsi="Calibri" w:cs="Calibri"/>
+                <w:sz w:val="19"/>
+                <w:szCs w:val="19"/>
+              </w:rPr>
+              <w:t>3</w:t>
+            </w:r>
+          </w:p>
+        </w:tc>
+        <w:tc>
+          <w:tcPr>
+            <w:tcW w:w="4395" w:type="dxa"/>
+          </w:tcPr>
+          <w:p>
+            <w:pPr>
+              <w:tabs>
+                <w:tab w:val="left" w:pos="1791"/>
+              </w:tabs>
+              <w:rPr>
+                <w:rFonts w:ascii="Calibri" w:hAnsi="Calibri" w:cs="Calibri"/>
+                <w:sz w:val="19"/>
+                <w:szCs w:val="19"/>
+              </w:rPr>
+            </w:pPr>
+            <w:r>
+              <w:rPr>
+                <w:rFonts w:ascii="Calibri" w:hAnsi="Calibri" w:cs="Calibri"/>
+                <w:sz w:val="19"/>
+                <w:szCs w:val="19"/>
+              </w:rPr>
+              <w:t>Column in the SQL but not declared in YAML</w:t>
+            </w:r>
+          </w:p>
+        </w:tc>
+        <w:tc>
+          <w:tcPr>
+            <w:tcW w:w="5499" w:type="dxa"/>
+          </w:tcPr>
+          <w:p>
+            <w:pPr>
+              <w:tabs>
+                <w:tab w:val="left" w:pos="1791"/>
+              </w:tabs>
+              <w:rPr>
+                <w:rFonts w:ascii="Calibri" w:hAnsi="Calibri" w:cs="Calibri"/>
+                <w:sz w:val="19"/>
+                <w:szCs w:val="19"/>
+              </w:rPr>
+            </w:pPr>
+            <w:r>
+              <w:rPr>
+                <w:rFonts w:ascii="Calibri" w:hAnsi="Calibri" w:cs="Calibri"/>
+                <w:sz w:val="19"/>
+                <w:szCs w:val="19"/>
+              </w:rPr>
+              <w:t>Fail (needs an all-columns check)</w:t>
+            </w:r>
+          </w:p>
+        </w:tc>
+      </w:tr>
+      <w:tr>
+        <w:tc>
+          <w:tcPr>
+            <w:tcW w:w="562" w:type="dxa"/>
+            <w:shd w:val="clear" w:color="auto" w:fill="EEF1F8"/>
+          </w:tcPr>
+          <w:p>
+            <w:pPr>
+              <w:tabs>
+                <w:tab w:val="left" w:pos="1791"/>
+              </w:tabs>
+              <w:rPr>
+                <w:rFonts w:ascii="Calibri" w:hAnsi="Calibri" w:cs="Calibri"/>
+                <w:sz w:val="19"/>
+                <w:szCs w:val="19"/>
+              </w:rPr>
+            </w:pPr>
+            <w:r>
+              <w:rPr>
+                <w:rFonts w:ascii="Calibri" w:hAnsi="Calibri" w:cs="Calibri"/>
+                <w:sz w:val="19"/>
+                <w:szCs w:val="19"/>
+              </w:rPr>
+              <w:t>4</w:t>
+            </w:r>
+          </w:p>
+        </w:tc>
+        <w:tc>
+          <w:tcPr>
+            <w:tcW w:w="4395" w:type="dxa"/>
+            <w:shd w:val="clear" w:color="auto" w:fill="EEF1F8"/>
+          </w:tcPr>
+          <w:p>
+            <w:pPr>
+              <w:tabs>
+                <w:tab w:val="left" w:pos="1791"/>
+              </w:tabs>
+              <w:rPr>
+                <w:rFonts w:ascii="Calibri" w:hAnsi="Calibri" w:cs="Calibri"/>
+                <w:sz w:val="19"/>
+                <w:szCs w:val="19"/>
+              </w:rPr>
+            </w:pPr>
+            <w:r>
+              <w:rPr>
+                <w:rFonts w:ascii="Calibri" w:hAnsi="Calibri" w:cs="Calibri"/>
+                <w:sz w:val="19"/>
+                <w:szCs w:val="19"/>
+              </w:rPr>
+              <w:t>Description deleted after an earlier build</w:t>
+            </w:r>
+          </w:p>
+        </w:tc>
+        <w:tc>
+          <w:tcPr>
+            <w:tcW w:w="5499" w:type="dxa"/>
+            <w:shd w:val="clear" w:color="auto" w:fill="EEF1F8"/>
+          </w:tcPr>
+          <w:p>
+            <w:pPr>
+              <w:tabs>
+                <w:tab w:val="left" w:pos="1791"/>
+              </w:tabs>
+              <w:rPr>
+                <w:rFonts w:ascii="Calibri" w:hAnsi="Calibri" w:cs="Calibri"/>
+                <w:sz w:val="19"/>
+                <w:szCs w:val="19"/>
+              </w:rPr>
+            </w:pPr>
+            <w:r>
+              <w:rPr>
+                <w:rFonts w:ascii="Calibri" w:hAnsi="Calibri" w:cs="Calibri"/>
+                <w:sz w:val="19"/>
+                <w:szCs w:val="19"/>
+              </w:rPr>
+              <w:t>Fail (CI re-parses the project first)</w:t>
+            </w:r>
+          </w:p>
+        </w:tc>
+      </w:tr>
+      <w:tr>
+        <w:tc>
+          <w:tcPr>
+            <w:tcW w:w="562" w:type="dxa"/>
+          </w:tcPr>
+          <w:p>
+            <w:pPr>
+              <w:tabs>
+                <w:tab w:val="left" w:pos="1791"/>
+              </w:tabs>
+              <w:rPr>
+                <w:rFonts w:ascii="Calibri" w:hAnsi="Calibri" w:cs="Calibri"/>
+                <w:sz w:val="19"/>
+                <w:szCs w:val="19"/>
+              </w:rPr>
+            </w:pPr>
+            <w:r>
+              <w:rPr>
+                <w:rFonts w:ascii="Calibri" w:hAnsi="Calibri" w:cs="Calibri"/>
+                <w:sz w:val="19"/>
+                <w:szCs w:val="19"/>
+              </w:rPr>
+              <w:t>5</w:t>
+            </w:r>
+          </w:p>
+        </w:tc>
+        <w:tc>
+          <w:tcPr>
+            <w:tcW w:w="4395" w:type="dxa"/>
+          </w:tcPr>
+          <w:p>
+            <w:pPr>
+              <w:tabs>
+                <w:tab w:val="left" w:pos="1791"/>
+              </w:tabs>
+              <w:rPr>
+                <w:rFonts w:ascii="Calibri" w:hAnsi="Calibri" w:cs="Calibri"/>
+                <w:sz w:val="19"/>
+                <w:szCs w:val="19"/>
+              </w:rPr>
+            </w:pPr>
+            <w:r>
+              <w:rPr>
+                <w:rFonts w:ascii="Calibri" w:hAnsi="Calibri" w:cs="Calibri"/>
+                <w:sz w:val="19"/>
+                <w:szCs w:val="19"/>
+              </w:rPr>
+              <w:t>Placeholder description (“TBD”)</w:t>
+            </w:r>
+          </w:p>
+        </w:tc>
+        <w:tc>
+          <w:tcPr>
+            <w:tcW w:w="5499" w:type="dxa"/>
+          </w:tcPr>
+          <w:p>
+            <w:pPr>
+              <w:tabs>
+                <w:tab w:val="left" w:pos="1791"/>
+              </w:tabs>
+              <w:rPr>
+                <w:rFonts w:ascii="Calibri" w:hAnsi="Calibri" w:cs="Calibri"/>
+                <w:sz w:val="19"/>
+                <w:szCs w:val="19"/>
+              </w:rPr>
+            </w:pPr>
+            <w:r>
+              <w:rPr>
+                <w:rFonts w:ascii="Calibri" w:hAnsi="Calibri" w:cs="Calibri"/>
+                <w:sz w:val="19"/>
+                <w:szCs w:val="19"/>
+              </w:rPr>
+              <w:t>Fail (custom check)</w:t>
+            </w:r>
+          </w:p>
+        </w:tc>
+      </w:tr>
+      <w:tr>
+        <w:tc>
+          <w:tcPr>
+            <w:tcW w:w="562" w:type="dxa"/>
+            <w:shd w:val="clear" w:color="auto" w:fill="EEF1F8"/>
+          </w:tcPr>
+          <w:p>
+            <w:pPr>
+              <w:tabs>
+                <w:tab w:val="left" w:pos="1791"/>
+              </w:tabs>
+              <w:rPr>
+                <w:rFonts w:ascii="Calibri" w:hAnsi="Calibri" w:cs="Calibri"/>
+                <w:sz w:val="19"/>
+                <w:szCs w:val="19"/>
+              </w:rPr>
+            </w:pPr>
+            <w:r>
+              <w:rPr>
+                <w:rFonts w:ascii="Calibri" w:hAnsi="Calibri" w:cs="Calibri"/>
+                <w:sz w:val="19"/>
+                <w:szCs w:val="19"/>
+              </w:rPr>
+              <w:t>6</w:t>
+            </w:r>
+          </w:p>
+        </w:tc>
+        <w:tc>
+          <w:tcPr>
+            <w:tcW w:w="4395" w:type="dxa"/>
+            <w:shd w:val="clear" w:color="auto" w:fill="EEF1F8"/>
+          </w:tcPr>
+          <w:p>
+            <w:pPr>
+              <w:tabs>
+                <w:tab w:val="left" w:pos="1791"/>
+              </w:tabs>
+              <w:rPr>
+                <w:rFonts w:ascii="Calibri" w:hAnsi="Calibri" w:cs="Calibri"/>
+                <w:sz w:val="19"/>
+                <w:szCs w:val="19"/>
+              </w:rPr>
+            </w:pPr>
+            <w:r>
+              <w:rPr>
+                <w:rFonts w:ascii="Calibri" w:hAnsi="Calibri" w:cs="Calibri"/>
+                <w:sz w:val="19"/>
+                <w:szCs w:val="19"/>
+              </w:rPr>
+              <w:t>Same column, different descriptions in two models</w:t>
+            </w:r>
+          </w:p>
+        </w:tc>
+        <w:tc>
+          <w:tcPr>
+            <w:tcW w:w="5499" w:type="dxa"/>
+            <w:shd w:val="clear" w:color="auto" w:fill="EEF1F8"/>
+          </w:tcPr>
+          <w:p>
+            <w:pPr>
+              <w:tabs>
+                <w:tab w:val="left" w:pos="1791"/>
+              </w:tabs>
+              <w:rPr>
+                <w:rFonts w:ascii="Calibri" w:hAnsi="Calibri" w:cs="Calibri"/>
+                <w:sz w:val="19"/>
+                <w:szCs w:val="19"/>
+              </w:rPr>
+            </w:pPr>
+            <w:r>
+              <w:rPr>
+                <w:rFonts w:ascii="Calibri" w:hAnsi="Calibri" w:cs="Calibri"/>
+                <w:sz w:val="19"/>
+                <w:szCs w:val="19"/>
+              </w:rPr>
+              <w:t>Fail</w:t>
+            </w:r>
+          </w:p>
+        </w:tc>
+      </w:tr>
+      <w:tr>
+        <w:tc>
+          <w:tcPr>
+            <w:tcW w:w="562" w:type="dxa"/>
+          </w:tcPr>
+          <w:p>
+            <w:pPr>
+              <w:tabs>
+                <w:tab w:val="left" w:pos="1791"/>
+              </w:tabs>
+              <w:rPr>
+                <w:rFonts w:ascii="Calibri" w:hAnsi="Calibri" w:cs="Calibri"/>
+                <w:sz w:val="19"/>
+                <w:szCs w:val="19"/>
+              </w:rPr>
+            </w:pPr>
+            <w:r>
+              <w:rPr>
+                <w:rFonts w:ascii="Calibri" w:hAnsi="Calibri" w:cs="Calibri"/>
+                <w:sz w:val="19"/>
+                <w:szCs w:val="19"/>
+              </w:rPr>
+              <w:t>7</w:t>
+            </w:r>
+          </w:p>
+        </w:tc>
+        <w:tc>
+          <w:tcPr>
+            <w:tcW w:w="4395" w:type="dxa"/>
+          </w:tcPr>
+          <w:p>
+            <w:pPr>
+              <w:tabs>
+                <w:tab w:val="left" w:pos="1791"/>
+              </w:tabs>
+              <w:rPr>
+                <w:rFonts w:ascii="Calibri" w:hAnsi="Calibri" w:cs="Calibri"/>
+                <w:sz w:val="19"/>
+                <w:szCs w:val="19"/>
+              </w:rPr>
+            </w:pPr>
+            <w:r>
+              <w:rPr>
+                <w:rFonts w:ascii="Calibri" w:hAnsi="Calibri" w:cs="Calibri"/>
+                <w:sz w:val="19"/>
+                <w:szCs w:val="19"/>
+              </w:rPr>
+              <w:t>Fully documented model</w:t>
+            </w:r>
+          </w:p>
+        </w:tc>
+        <w:tc>
+          <w:tcPr>
+            <w:tcW w:w="5499" w:type="dxa"/>
+          </w:tcPr>
+          <w:p>
+            <w:pPr>
+              <w:tabs>
+                <w:tab w:val="left" w:pos="1791"/>
+              </w:tabs>
+              <w:rPr>
+                <w:rFonts w:ascii="Calibri" w:hAnsi="Calibri" w:cs="Calibri"/>
+                <w:sz w:val="19"/>
+                <w:szCs w:val="19"/>
+              </w:rPr>
+            </w:pPr>
+            <w:r>
+              <w:rPr>
+                <w:rFonts w:ascii="Calibri" w:hAnsi="Calibri" w:cs="Calibri"/>
+                <w:sz w:val="19"/>
+                <w:szCs w:val="19"/>
+              </w:rPr>
+              <w:t>Pass, no false alarm</w:t>
+            </w:r>
+          </w:p>
+        </w:tc>
+      </w:tr>
+      <w:tr>
+        <w:tc>
+          <w:tcPr>
+            <w:tcW w:w="562" w:type="dxa"/>
+            <w:shd w:val="clear" w:color="auto" w:fill="EEF1F8"/>
+          </w:tcPr>
+          <w:p>
+            <w:pPr>
+              <w:tabs>
+                <w:tab w:val="left" w:pos="1791"/>
+              </w:tabs>
+              <w:rPr>
+                <w:rFonts w:ascii="Calibri" w:hAnsi="Calibri" w:cs="Calibri"/>
+                <w:sz w:val="19"/>
+                <w:szCs w:val="19"/>
+              </w:rPr>
+            </w:pPr>
+            <w:r>
+              <w:rPr>
+                <w:rFonts w:ascii="Calibri" w:hAnsi="Calibri" w:cs="Calibri"/>
+                <w:sz w:val="19"/>
+                <w:szCs w:val="19"/>
+              </w:rPr>
+              <w:t>8</w:t>
+            </w:r>
+          </w:p>
+        </w:tc>
+        <w:tc>
+          <w:tcPr>
+            <w:tcW w:w="4395" w:type="dxa"/>
+            <w:shd w:val="clear" w:color="auto" w:fill="EEF1F8"/>
+          </w:tcPr>
+          <w:p>
+            <w:pPr>
+              <w:tabs>
+                <w:tab w:val="left" w:pos="1791"/>
+              </w:tabs>
+              <w:rPr>
+                <w:rFonts w:ascii="Calibri" w:hAnsi="Calibri" w:cs="Calibri"/>
+                <w:sz w:val="19"/>
+                <w:szCs w:val="19"/>
+              </w:rPr>
+            </w:pPr>
+            <w:r>
+              <w:rPr>
+                <w:rFonts w:ascii="Calibri" w:hAnsi="Calibri" w:cs="Calibri"/>
+                <w:sz w:val="19"/>
+                <w:szCs w:val="19"/>
+              </w:rPr>
+              <w:t>Direct push to main, bypassing the PR</w:t>
+            </w:r>
+          </w:p>
+        </w:tc>
+        <w:tc>
+          <w:tcPr>
+            <w:tcW w:w="5499" w:type="dxa"/>
+            <w:shd w:val="clear" w:color="auto" w:fill="EEF1F8"/>
+          </w:tcPr>
+          <w:p>
+            <w:pPr>
+              <w:tabs>
+                <w:tab w:val="left" w:pos="1791"/>
+              </w:tabs>
+              <w:rPr>
+                <w:rFonts w:ascii="Calibri" w:hAnsi="Calibri" w:cs="Calibri"/>
+                <w:sz w:val="19"/>
+                <w:szCs w:val="19"/>
+              </w:rPr>
+            </w:pPr>
+            <w:r>
+              <w:rPr>
+                <w:rFonts w:ascii="Calibri" w:hAnsi="Calibri" w:cs="Calibri"/>
+                <w:sz w:val="19"/>
+                <w:szCs w:val="19"/>
+              </w:rPr>
+              <w:t>Blocked, including for the repository owner</w:t>
+            </w:r>
+          </w:p>
+        </w:tc>
+      </w:tr>
+    </w:tbl>
+    <w:p>
+      <w:pPr>
+        <w:tabs>
+          <w:tab w:val="left" w:pos="1791"/>
+        </w:tabs>
+        <w:rPr>
+          <w:rFonts w:ascii="Calibri" w:hAnsi="Calibri" w:cs="Calibri"/>
+        </w:rPr>
+      </w:pPr>
+    </w:p>
+    <w:p>
+      <w:pPr>
+        <w:tabs>
+          <w:tab w:val="left" w:pos="1791"/>
+        </w:tabs>
+        <w:rPr>
+          <w:rFonts w:ascii="Calibri" w:hAnsi="Calibri" w:cs="Calibri"/>
+        </w:rPr>
+      </w:pPr>
+      <w:r>
+        <w:rPr>
+          <w:rFonts w:ascii="Calibri" w:hAnsi="Calibri" w:cs="Calibri"/>
+          <w:b/>
+          <w:bCs/>
+        </w:rPr>
+        <w:t>Pass criteria.</w:t>
+      </w:r>
+      <w:r>
+        <w:rPr>
+          <w:rFonts w:ascii="Calibri" w:hAnsi="Calibri" w:cs="Calibri"/>
+        </w:rPr>
+        <w:t xml:space="preserve"> Every planted defect fails as expected, case 7 passes, and case 8 proves the gate cannot be skipped.</w:t>
+      </w:r>
+    </w:p>
+    <w:p>
+      <w:pPr>
+        <w:tabs>
+          <w:tab w:val="left" w:pos="1791"/>
+        </w:tabs>
+        <w:rPr>
+          <w:rFonts w:ascii="Calibri" w:hAnsi="Calibri" w:cs="Calibri"/>
+        </w:rPr>
+      </w:pPr>
+      <w:r>
+        <w:rPr>
+          <w:rFonts w:ascii="Calibri" w:hAnsi="Calibri" w:cs="Calibri"/>
+          <w:b/>
+          <w:bCs/>
+        </w:rPr>
+        <w:t>Known limit.</w:t>
+      </w:r>
+      <w:r>
+        <w:rPr>
+          <w:rFonts w:ascii="Calibri" w:hAnsi="Calibri" w:cs="Calibri"/>
+        </w:rPr>
+        <w:t xml:space="preserve"> The gate proves documentation exists and is consistent, not that it is true. Accuracy stays with MET-001’s quarterly audit and domain-owner review.</w:t>
+      </w:r>
+    </w:p>
+    <w:p>
+      <w:pPr>
+        <w:tabs>
+          <w:tab w:val="left" w:pos="1791"/>
+        </w:tabs>
+        <w:rPr>
+          <w:rFonts w:ascii="Calibri" w:hAnsi="Calibri" w:cs="Calibri"/>
+        </w:rPr>
+      </w:pPr>
+      <w:r>
+        <w:rPr>
+          <w:rFonts w:ascii="Calibri" w:hAnsi="Calibri" w:cs="Calibri"/>
+          <w:b/>
+          <w:bCs/>
+        </w:rPr>
+        <w:t>Dependencies.</w:t>
+      </w:r>
+      <w:r>
+        <w:rPr>
+          <w:rFonts w:ascii="Calibri" w:hAnsi="Calibri" w:cs="Calibri"/>
+        </w:rPr>
+        <w:t xml:space="preserve"> A small throwaway dbt project with synthetic models. Description checks read </w:t>
       </w:r>
       <w:proofErr w:type="spellStart"/>
       <w:r>
         <w:rPr>
           <w:rFonts w:ascii="Calibri" w:hAnsi="Calibri" w:cs="Calibri"/>
         </w:rPr>
-        <w:t>schema.yml</w:t>
+        <w:t>dbt’s</w:t>
       </w:r>
       <w:proofErr w:type="spellEnd"/>
       <w:r>
         <w:rPr>
           <w:rFonts w:ascii="Calibri" w:hAnsi="Calibri" w:cs="Calibri"/>
         </w:rPr>
-        <w:t xml:space="preserve"> at build time (Section </w:t>
-      </w:r>
+        <w:t xml:space="preserve"> manifest and YAML files, while column checks also need </w:t>
+      </w:r>
+      <w:proofErr w:type="spellStart"/>
+      <w:r>
+        <w:rPr>
+          <w:rFonts w:ascii="Calibri" w:hAnsi="Calibri" w:cs="Calibri"/>
+        </w:rPr>
+        <w:t>catalog</w:t>
+      </w:r>
+      <w:proofErr w:type="spellEnd"/>
+      <w:r>
+        <w:rPr>
+          <w:rFonts w:ascii="Calibri" w:hAnsi="Calibri" w:cs="Calibri"/>
+        </w:rPr>
+        <w:t xml:space="preserve"> metadata, so cases 1, 2 and 4-7 can run on a local setup. Case 3 and all Fabric-specific behaviour must be confirmed against Fabric.</w:t>
+      </w:r>
+    </w:p>
+    <w:p>
+      <w:pPr>
+        <w:tabs>
+          <w:tab w:val="left" w:pos="1791"/>
+        </w:tabs>
+        <w:rPr>
+          <w:rFonts w:ascii="Calibri" w:hAnsi="Calibri" w:cs="Calibri"/>
+        </w:rPr>
+      </w:pPr>
     </w:p>
     <w:p>
       <w:pPr>
@@ -3964,6 +4758,7 @@
           <w:sz w:val="32"/>
           <w:szCs w:val="32"/>
         </w:rPr>
+        <w:lastRenderedPageBreak/>
         <w:t>Business/UAT Validation</w:t>
       </w:r>
     </w:p>
@@ -3979,68 +4774,623 @@
       <w:r>
         <w:rPr>
           <w:rFonts w:ascii="Calibri" w:hAnsi="Calibri" w:cs="Calibri"/>
+        </w:rPr>
+        <w:t xml:space="preserve">UAT confirms </w:t>
+      </w:r>
+      <w:r>
+        <w:rPr>
+          <w:rFonts w:ascii="Calibri" w:hAnsi="Calibri" w:cs="Calibri"/>
+        </w:rPr>
+        <w:t xml:space="preserve">that what was built meets what was agreed. It is the business’s acceptance, not the engineering </w:t>
+      </w:r>
+      <w:proofErr w:type="spellStart"/>
+      <w:r>
+        <w:rPr>
+          <w:rFonts w:ascii="Calibri" w:hAnsi="Calibri" w:cs="Calibri"/>
+        </w:rPr>
+        <w:t>team’s</w:t>
+      </w:r>
+      <w:proofErr w:type="spellEnd"/>
+      <w:r>
+        <w:rPr>
+          <w:rFonts w:ascii="Calibri" w:hAnsi="Calibri" w:cs="Calibri"/>
+        </w:rPr>
+        <w:t>.</w:t>
+      </w:r>
+    </w:p>
+    <w:p>
+      <w:pPr>
+        <w:tabs>
+          <w:tab w:val="left" w:pos="1791"/>
+        </w:tabs>
+        <w:rPr>
+          <w:rFonts w:ascii="Calibri" w:hAnsi="Calibri" w:cs="Calibri"/>
+        </w:rPr>
+      </w:pPr>
+      <w:r>
+        <w:rPr>
+          <w:rFonts w:ascii="Calibri" w:hAnsi="Calibri" w:cs="Calibri"/>
+        </w:rPr>
+        <w:t>Who validates what.</w:t>
+      </w:r>
+    </w:p>
+    <w:tbl>
+      <w:tblPr>
+        <w:tblStyle w:val="TableGrid"/>
+        <w:tblW w:w="0" w:type="auto"/>
+        <w:tblBorders>
+          <w:top w:val="single" w:sz="4" w:space="0" w:color="D0D8EC"/>
+          <w:left w:val="single" w:sz="4" w:space="0" w:color="D0D8EC"/>
+          <w:bottom w:val="single" w:sz="4" w:space="0" w:color="D0D8EC"/>
+          <w:right w:val="single" w:sz="4" w:space="0" w:color="D0D8EC"/>
+          <w:insideH w:val="single" w:sz="4" w:space="0" w:color="D0D8EC"/>
+          <w:insideV w:val="single" w:sz="4" w:space="0" w:color="D0D8EC"/>
+        </w:tblBorders>
+        <w:tblLook w:val="04A0" w:firstRow="1" w:lastRow="0" w:firstColumn="1" w:lastColumn="0" w:noHBand="0" w:noVBand="1"/>
+      </w:tblPr>
+      <w:tblGrid>
+        <w:gridCol w:w="3647"/>
+        <w:gridCol w:w="3638"/>
+        <w:gridCol w:w="3171"/>
+      </w:tblGrid>
+      <w:tr>
+        <w:tc>
+          <w:tcPr>
+            <w:tcW w:w="3647" w:type="dxa"/>
+            <w:shd w:val="clear" w:color="auto" w:fill="1A2E5A"/>
+          </w:tcPr>
+          <w:p>
+            <w:pPr>
+              <w:tabs>
+                <w:tab w:val="left" w:pos="1791"/>
+              </w:tabs>
+              <w:rPr>
+                <w:rFonts w:ascii="Calibri" w:hAnsi="Calibri" w:cs="Calibri"/>
+                <w:b/>
+                <w:bCs/>
+                <w:sz w:val="20"/>
+                <w:szCs w:val="20"/>
+              </w:rPr>
+            </w:pPr>
+            <w:r>
+              <w:rPr>
+                <w:rFonts w:ascii="Calibri" w:hAnsi="Calibri" w:cs="Calibri"/>
+                <w:b/>
+                <w:bCs/>
+                <w:sz w:val="20"/>
+                <w:szCs w:val="20"/>
+              </w:rPr>
+              <w:t>Requirements</w:t>
+            </w:r>
+          </w:p>
+        </w:tc>
+        <w:tc>
+          <w:tcPr>
+            <w:tcW w:w="3638" w:type="dxa"/>
+            <w:shd w:val="clear" w:color="auto" w:fill="1A2E5A"/>
+          </w:tcPr>
+          <w:p>
+            <w:pPr>
+              <w:tabs>
+                <w:tab w:val="left" w:pos="1791"/>
+              </w:tabs>
+              <w:rPr>
+                <w:rFonts w:ascii="Calibri" w:hAnsi="Calibri" w:cs="Calibri"/>
+                <w:b/>
+                <w:bCs/>
+                <w:sz w:val="20"/>
+                <w:szCs w:val="20"/>
+              </w:rPr>
+            </w:pPr>
+            <w:r>
+              <w:rPr>
+                <w:rFonts w:ascii="Calibri" w:hAnsi="Calibri" w:cs="Calibri"/>
+                <w:b/>
+                <w:bCs/>
+                <w:sz w:val="20"/>
+                <w:szCs w:val="20"/>
+              </w:rPr>
+              <w:t>Validated by</w:t>
+            </w:r>
+          </w:p>
+        </w:tc>
+        <w:tc>
+          <w:tcPr>
+            <w:tcW w:w="3171" w:type="dxa"/>
+            <w:shd w:val="clear" w:color="auto" w:fill="1A2E5A"/>
+          </w:tcPr>
+          <w:p>
+            <w:pPr>
+              <w:tabs>
+                <w:tab w:val="left" w:pos="1791"/>
+              </w:tabs>
+              <w:rPr>
+                <w:rFonts w:ascii="Calibri" w:hAnsi="Calibri" w:cs="Calibri"/>
+                <w:b/>
+                <w:bCs/>
+                <w:sz w:val="20"/>
+                <w:szCs w:val="20"/>
+              </w:rPr>
+            </w:pPr>
+            <w:r>
+              <w:rPr>
+                <w:rFonts w:ascii="Calibri" w:hAnsi="Calibri" w:cs="Calibri"/>
+                <w:b/>
+                <w:bCs/>
+                <w:sz w:val="20"/>
+                <w:szCs w:val="20"/>
+              </w:rPr>
+              <w:t>Go-live sign-off</w:t>
+            </w:r>
+          </w:p>
+        </w:tc>
+      </w:tr>
+      <w:tr>
+        <w:tc>
+          <w:tcPr>
+            <w:tcW w:w="3647" w:type="dxa"/>
+          </w:tcPr>
+          <w:p>
+            <w:pPr>
+              <w:tabs>
+                <w:tab w:val="left" w:pos="1791"/>
+              </w:tabs>
+              <w:rPr>
+                <w:rFonts w:ascii="Calibri" w:hAnsi="Calibri" w:cs="Calibri"/>
+                <w:sz w:val="20"/>
+                <w:szCs w:val="20"/>
+              </w:rPr>
+            </w:pPr>
+            <w:r>
+              <w:rPr>
+                <w:rFonts w:ascii="Calibri" w:hAnsi="Calibri" w:cs="Calibri"/>
+                <w:sz w:val="20"/>
+                <w:szCs w:val="20"/>
+              </w:rPr>
+              <w:t>Domain requirements (FR-PRO, FR-INV, FR-SAL, FR-CUS, FR-FIN, FR-MKT)</w:t>
+            </w:r>
+          </w:p>
+        </w:tc>
+        <w:tc>
+          <w:tcPr>
+            <w:tcW w:w="3638" w:type="dxa"/>
+          </w:tcPr>
+          <w:p>
+            <w:pPr>
+              <w:tabs>
+                <w:tab w:val="left" w:pos="1791"/>
+              </w:tabs>
+              <w:rPr>
+                <w:rFonts w:ascii="Calibri" w:hAnsi="Calibri" w:cs="Calibri"/>
+                <w:sz w:val="20"/>
+                <w:szCs w:val="20"/>
+              </w:rPr>
+            </w:pPr>
+            <w:r>
+              <w:rPr>
+                <w:rFonts w:ascii="Calibri" w:hAnsi="Calibri" w:cs="Calibri"/>
+                <w:sz w:val="20"/>
+                <w:szCs w:val="20"/>
+              </w:rPr>
+              <w:t>The domain’s owner, against each requirement’s FRD-001 acceptance criteria</w:t>
+            </w:r>
+          </w:p>
+        </w:tc>
+        <w:tc>
+          <w:tcPr>
+            <w:tcW w:w="3171" w:type="dxa"/>
+          </w:tcPr>
+          <w:p>
+            <w:pPr>
+              <w:tabs>
+                <w:tab w:val="left" w:pos="1791"/>
+              </w:tabs>
+              <w:rPr>
+                <w:rFonts w:ascii="Calibri" w:hAnsi="Calibri" w:cs="Calibri"/>
+                <w:sz w:val="20"/>
+                <w:szCs w:val="20"/>
+              </w:rPr>
+            </w:pPr>
+            <w:r>
+              <w:rPr>
+                <w:rFonts w:ascii="Calibri" w:hAnsi="Calibri" w:cs="Calibri"/>
+                <w:sz w:val="20"/>
+                <w:szCs w:val="20"/>
+              </w:rPr>
+              <w:t>Domain owner and CDO</w:t>
+            </w:r>
+          </w:p>
+        </w:tc>
+      </w:tr>
+      <w:tr>
+        <w:tc>
+          <w:tcPr>
+            <w:tcW w:w="3647" w:type="dxa"/>
+            <w:shd w:val="clear" w:color="auto" w:fill="EEF1F8"/>
+          </w:tcPr>
+          <w:p>
+            <w:pPr>
+              <w:tabs>
+                <w:tab w:val="left" w:pos="1791"/>
+              </w:tabs>
+              <w:rPr>
+                <w:rFonts w:ascii="Calibri" w:hAnsi="Calibri" w:cs="Calibri"/>
+                <w:sz w:val="20"/>
+                <w:szCs w:val="20"/>
+              </w:rPr>
+            </w:pPr>
+            <w:r>
+              <w:rPr>
+                <w:rFonts w:ascii="Calibri" w:hAnsi="Calibri" w:cs="Calibri"/>
+                <w:sz w:val="20"/>
+                <w:szCs w:val="20"/>
+              </w:rPr>
+              <w:t>FR-CCR-005 (reconciliation)</w:t>
+            </w:r>
+          </w:p>
+        </w:tc>
+        <w:tc>
+          <w:tcPr>
+            <w:tcW w:w="3638" w:type="dxa"/>
+            <w:shd w:val="clear" w:color="auto" w:fill="EEF1F8"/>
+          </w:tcPr>
+          <w:p>
+            <w:pPr>
+              <w:tabs>
+                <w:tab w:val="left" w:pos="1791"/>
+              </w:tabs>
+              <w:rPr>
+                <w:rFonts w:ascii="Calibri" w:hAnsi="Calibri" w:cs="Calibri"/>
+                <w:sz w:val="20"/>
+                <w:szCs w:val="20"/>
+              </w:rPr>
+            </w:pPr>
+            <w:r>
+              <w:rPr>
+                <w:rFonts w:ascii="Calibri" w:hAnsi="Calibri" w:cs="Calibri"/>
+                <w:sz w:val="20"/>
+                <w:szCs w:val="20"/>
+              </w:rPr>
+              <w:t>Johan van der Merwe</w:t>
+            </w:r>
+          </w:p>
+        </w:tc>
+        <w:tc>
+          <w:tcPr>
+            <w:tcW w:w="3171" w:type="dxa"/>
+            <w:shd w:val="clear" w:color="auto" w:fill="EEF1F8"/>
+          </w:tcPr>
+          <w:p>
+            <w:pPr>
+              <w:tabs>
+                <w:tab w:val="left" w:pos="1791"/>
+              </w:tabs>
+              <w:rPr>
+                <w:rFonts w:ascii="Calibri" w:hAnsi="Calibri" w:cs="Calibri"/>
+                <w:sz w:val="20"/>
+                <w:szCs w:val="20"/>
+              </w:rPr>
+            </w:pPr>
+            <w:r>
+              <w:rPr>
+                <w:rFonts w:ascii="Calibri" w:hAnsi="Calibri" w:cs="Calibri"/>
+                <w:sz w:val="20"/>
+                <w:szCs w:val="20"/>
+              </w:rPr>
+              <w:t>CDO</w:t>
+            </w:r>
+          </w:p>
+        </w:tc>
+      </w:tr>
+      <w:tr>
+        <w:tc>
+          <w:tcPr>
+            <w:tcW w:w="3647" w:type="dxa"/>
+          </w:tcPr>
+          <w:p>
+            <w:pPr>
+              <w:tabs>
+                <w:tab w:val="left" w:pos="1791"/>
+              </w:tabs>
+              <w:rPr>
+                <w:rFonts w:ascii="Calibri" w:hAnsi="Calibri" w:cs="Calibri"/>
+                <w:sz w:val="20"/>
+                <w:szCs w:val="20"/>
+              </w:rPr>
+            </w:pPr>
+            <w:r>
+              <w:rPr>
+                <w:rFonts w:ascii="Calibri" w:hAnsi="Calibri" w:cs="Calibri"/>
+                <w:sz w:val="20"/>
+                <w:szCs w:val="20"/>
+              </w:rPr>
+              <w:t>FR-CCR-004, FR-CCR-008 (POPIA)</w:t>
+            </w:r>
+          </w:p>
+        </w:tc>
+        <w:tc>
+          <w:tcPr>
+            <w:tcW w:w="3638" w:type="dxa"/>
+          </w:tcPr>
+          <w:p>
+            <w:pPr>
+              <w:tabs>
+                <w:tab w:val="left" w:pos="1791"/>
+              </w:tabs>
+              <w:rPr>
+                <w:rFonts w:ascii="Calibri" w:hAnsi="Calibri" w:cs="Calibri"/>
+                <w:sz w:val="20"/>
+                <w:szCs w:val="20"/>
+              </w:rPr>
+            </w:pPr>
+            <w:r>
+              <w:rPr>
+                <w:rFonts w:ascii="Calibri" w:hAnsi="Calibri" w:cs="Calibri"/>
+                <w:sz w:val="20"/>
+                <w:szCs w:val="20"/>
+              </w:rPr>
+              <w:t>Priya Naidoo</w:t>
+            </w:r>
+          </w:p>
+        </w:tc>
+        <w:tc>
+          <w:tcPr>
+            <w:tcW w:w="3171" w:type="dxa"/>
+          </w:tcPr>
+          <w:p>
+            <w:pPr>
+              <w:tabs>
+                <w:tab w:val="left" w:pos="1791"/>
+              </w:tabs>
+              <w:rPr>
+                <w:rFonts w:ascii="Calibri" w:hAnsi="Calibri" w:cs="Calibri"/>
+                <w:sz w:val="20"/>
+                <w:szCs w:val="20"/>
+              </w:rPr>
+            </w:pPr>
+            <w:r>
+              <w:rPr>
+                <w:rFonts w:ascii="Calibri" w:hAnsi="Calibri" w:cs="Calibri"/>
+                <w:sz w:val="20"/>
+                <w:szCs w:val="20"/>
+              </w:rPr>
+              <w:t>CDO</w:t>
+            </w:r>
+          </w:p>
+        </w:tc>
+      </w:tr>
+      <w:tr>
+        <w:tc>
+          <w:tcPr>
+            <w:tcW w:w="3647" w:type="dxa"/>
+          </w:tcPr>
+          <w:p>
+            <w:pPr>
+              <w:tabs>
+                <w:tab w:val="left" w:pos="1791"/>
+              </w:tabs>
+              <w:rPr>
+                <w:rFonts w:ascii="Calibri" w:hAnsi="Calibri" w:cs="Calibri"/>
+                <w:sz w:val="20"/>
+                <w:szCs w:val="20"/>
+              </w:rPr>
+            </w:pPr>
+            <w:r>
+              <w:rPr>
+                <w:rFonts w:ascii="Calibri" w:hAnsi="Calibri" w:cs="Calibri"/>
+                <w:sz w:val="20"/>
+                <w:szCs w:val="20"/>
+              </w:rPr>
+              <w:t>FR-CCR-001 to 003, 006, 007</w:t>
+            </w:r>
+          </w:p>
+        </w:tc>
+        <w:tc>
+          <w:tcPr>
+            <w:tcW w:w="3638" w:type="dxa"/>
+          </w:tcPr>
+          <w:p>
+            <w:pPr>
+              <w:tabs>
+                <w:tab w:val="left" w:pos="1791"/>
+              </w:tabs>
+              <w:rPr>
+                <w:rFonts w:ascii="Calibri" w:hAnsi="Calibri" w:cs="Calibri"/>
+                <w:sz w:val="20"/>
+                <w:szCs w:val="20"/>
+              </w:rPr>
+            </w:pPr>
+            <w:r>
+              <w:rPr>
+                <w:rFonts w:ascii="Calibri" w:hAnsi="Calibri" w:cs="Calibri"/>
+                <w:sz w:val="20"/>
+                <w:szCs w:val="20"/>
+              </w:rPr>
+              <w:t>CDO (single signer by design; no business owner depends on these directly)</w:t>
+            </w:r>
+          </w:p>
+        </w:tc>
+        <w:tc>
+          <w:tcPr>
+            <w:tcW w:w="3171" w:type="dxa"/>
+          </w:tcPr>
+          <w:p>
+            <w:pPr>
+              <w:tabs>
+                <w:tab w:val="left" w:pos="1791"/>
+              </w:tabs>
+              <w:rPr>
+                <w:rFonts w:ascii="Calibri" w:hAnsi="Calibri" w:cs="Calibri"/>
+                <w:sz w:val="20"/>
+                <w:szCs w:val="20"/>
+              </w:rPr>
+            </w:pPr>
+            <w:r>
+              <w:rPr>
+                <w:rFonts w:ascii="Calibri" w:hAnsi="Calibri" w:cs="Calibri"/>
+                <w:sz w:val="20"/>
+                <w:szCs w:val="20"/>
+              </w:rPr>
+              <w:t>CDO</w:t>
+            </w:r>
+          </w:p>
+        </w:tc>
+      </w:tr>
+    </w:tbl>
+    <w:p>
+      <w:pPr>
+        <w:tabs>
+          <w:tab w:val="left" w:pos="1791"/>
+        </w:tabs>
+        <w:rPr>
+          <w:rFonts w:ascii="Calibri" w:hAnsi="Calibri" w:cs="Calibri"/>
+        </w:rPr>
+      </w:pPr>
+    </w:p>
+    <w:p>
+      <w:pPr>
+        <w:tabs>
+          <w:tab w:val="left" w:pos="1791"/>
+        </w:tabs>
+        <w:rPr>
+          <w:rFonts w:ascii="Calibri" w:hAnsi="Calibri" w:cs="Calibri"/>
+        </w:rPr>
+      </w:pPr>
+      <w:r>
+        <w:rPr>
+          <w:rFonts w:ascii="Calibri" w:hAnsi="Calibri" w:cs="Calibri"/>
+        </w:rPr>
+        <w:t>The Lead Data Engineer demonstrates requirements during UAT but never validates them, keeping validation independent of the build.</w:t>
+      </w:r>
+    </w:p>
+    <w:p>
+      <w:pPr>
+        <w:tabs>
+          <w:tab w:val="left" w:pos="1791"/>
+        </w:tabs>
+        <w:rPr>
+          <w:rFonts w:ascii="Calibri" w:hAnsi="Calibri" w:cs="Calibri"/>
+        </w:rPr>
+      </w:pPr>
+      <w:r>
+        <w:rPr>
+          <w:rFonts w:ascii="Calibri" w:hAnsi="Calibri" w:cs="Calibri"/>
           <w:b/>
           <w:bCs/>
         </w:rPr>
-        <w:t>Enforcement — automated, not memory-dependent.</w:t>
-      </w:r>
-      <w:r>
-        <w:rPr>
-          <w:rFonts w:ascii="Calibri" w:hAnsi="Calibri" w:cs="Calibri"/>
-        </w:rPr>
-        <w:t xml:space="preserve"> Rather than relying on individual engineers remembering to document their work, or a lead manually checking every change, documentation completeness is enforced as an </w:t>
-      </w:r>
+        <w:t>When</w:t>
+      </w:r>
+      <w:r>
+        <w:rPr>
+          <w:rFonts w:ascii="Calibri" w:hAnsi="Calibri" w:cs="Calibri"/>
+        </w:rPr>
+        <w:t xml:space="preserve">. </w:t>
+      </w:r>
+      <w:r>
+        <w:rPr>
+          <w:rFonts w:ascii="Calibri" w:hAnsi="Calibri" w:cs="Calibri"/>
+        </w:rPr>
+        <w:t>UAT runs per domain as each is built, not once at the end of the build, starting with Sales. Problems surface while they are cheap to fix, and stakeholders see the platform incrementally, not for the first time all at once.</w:t>
+      </w:r>
+    </w:p>
+    <w:p>
+      <w:pPr>
+        <w:tabs>
+          <w:tab w:val="left" w:pos="1791"/>
+        </w:tabs>
+        <w:rPr>
+          <w:rFonts w:ascii="Calibri" w:hAnsi="Calibri" w:cs="Calibri"/>
+          <w:i/>
+          <w:iCs/>
+        </w:rPr>
+      </w:pPr>
       <w:r>
         <w:rPr>
           <w:rFonts w:ascii="Calibri" w:hAnsi="Calibri" w:cs="Calibri"/>
           <w:b/>
           <w:bCs/>
         </w:rPr>
-        <w:t>automated build gate</w:t>
-      </w:r>
-      <w:r>
-        <w:rPr>
-          <w:rFonts w:ascii="Calibri" w:hAnsi="Calibri" w:cs="Calibri"/>
-        </w:rPr>
-        <w:t xml:space="preserve">: a dbt build fails if any new or changed model or column lacks a description. This applies the same principle already established for data quality (Section 4's </w:t>
-      </w:r>
-      <w:proofErr w:type="spellStart"/>
-      <w:r>
-        <w:rPr>
-          <w:rFonts w:ascii="Calibri" w:hAnsi="Calibri" w:cs="Calibri"/>
-        </w:rPr>
-        <w:t>schema.yml</w:t>
-      </w:r>
-      <w:proofErr w:type="spellEnd"/>
-      <w:r>
-        <w:rPr>
-          <w:rFonts w:ascii="Calibri" w:hAnsi="Calibri" w:cs="Calibri"/>
-        </w:rPr>
-        <w:t>-driven dbt tests) to documentation itself — the pipeline, not a person's memory, is what actually prevents drift at the point of change.</w:t>
-      </w:r>
-      <w:r>
-        <w:rPr>
-          <w:rFonts w:ascii="Calibri" w:hAnsi="Calibri" w:cs="Calibri"/>
-        </w:rPr>
-        <w:t xml:space="preserve"> </w:t>
-      </w:r>
-      <w:r>
-        <w:rPr>
-          <w:rFonts w:ascii="Calibri" w:hAnsi="Calibri" w:cs="Calibri"/>
-        </w:rPr>
-        <w:t>This gate is tested and confirmed live during Step 1</w:t>
-      </w:r>
-      <w:r>
-        <w:rPr>
-          <w:rFonts w:ascii="Calibri" w:hAnsi="Calibri" w:cs="Calibri"/>
-        </w:rPr>
-        <w:t>2</w:t>
-      </w:r>
-      <w:r>
-        <w:rPr>
-          <w:rFonts w:ascii="Calibri" w:hAnsi="Calibri" w:cs="Calibri"/>
-        </w:rPr>
-        <w:t>, before the first model is built in Step 14 — not introduced partway through the build. This ensures no column is ever built without documentation being enforced from the very first commit, avoiding a backlog of undocumented "legacy" columns that predate the gate's existence.</w:t>
+        <w:t>Data</w:t>
+      </w:r>
+      <w:r>
+        <w:rPr>
+          <w:rFonts w:ascii="Calibri" w:hAnsi="Calibri" w:cs="Calibri"/>
+        </w:rPr>
+        <w:t xml:space="preserve">. </w:t>
+      </w:r>
+      <w:r>
+        <w:rPr>
+          <w:rFonts w:ascii="Calibri" w:hAnsi="Calibri" w:cs="Calibri"/>
+        </w:rPr>
+        <w:t xml:space="preserve">Build and test environments use synthetic or masked data, never raw production personal data. UAT runs in a controlled environment where owners can compare results against figures they already trust; for domains holding personal information, access is restricted per MET-001’s POPIA tiers and subject to ADR-002 and ADR-007 sign-off. </w:t>
+      </w:r>
+      <w:r>
+        <w:rPr>
+          <w:rFonts w:ascii="Calibri" w:hAnsi="Calibri" w:cs="Calibri"/>
+          <w:i/>
+          <w:iCs/>
+        </w:rPr>
+        <w:t>For RetailSphere as a portfolio project, synthetic data with the generator’s answer key stands in for real data. This tests correctness but not business recognition, which is a stated limitation.</w:t>
+      </w:r>
+    </w:p>
+    <w:p>
+      <w:pPr>
+        <w:tabs>
+          <w:tab w:val="left" w:pos="1791"/>
+        </w:tabs>
+        <w:rPr>
+          <w:rFonts w:ascii="Calibri" w:hAnsi="Calibri" w:cs="Calibri"/>
+        </w:rPr>
+      </w:pPr>
+      <w:r>
+        <w:rPr>
+          <w:rFonts w:ascii="Calibri" w:hAnsi="Calibri" w:cs="Calibri"/>
+          <w:b/>
+          <w:bCs/>
+        </w:rPr>
+        <w:t>Rejection</w:t>
+      </w:r>
+      <w:r>
+        <w:rPr>
+          <w:rFonts w:ascii="Calibri" w:hAnsi="Calibri" w:cs="Calibri"/>
+        </w:rPr>
+        <w:t xml:space="preserve">. </w:t>
+      </w:r>
+      <w:r>
+        <w:rPr>
+          <w:rFonts w:ascii="Calibri" w:hAnsi="Calibri" w:cs="Calibri"/>
+        </w:rPr>
+        <w:t>An owner may reject a requirement with a reason and a preferred outcome. Rejections are logged as defects, fixed and re-tested.</w:t>
+      </w:r>
+    </w:p>
+    <w:p>
+      <w:pPr>
+        <w:tabs>
+          <w:tab w:val="left" w:pos="1791"/>
+        </w:tabs>
+        <w:rPr>
+          <w:rFonts w:ascii="Calibri" w:hAnsi="Calibri" w:cs="Calibri"/>
+        </w:rPr>
+      </w:pPr>
+      <w:r>
+        <w:rPr>
+          <w:rFonts w:ascii="Calibri" w:hAnsi="Calibri" w:cs="Calibri"/>
+          <w:b/>
+          <w:bCs/>
+        </w:rPr>
+        <w:t>Go-live</w:t>
+      </w:r>
+      <w:r>
+        <w:rPr>
+          <w:rFonts w:ascii="Calibri" w:hAnsi="Calibri" w:cs="Calibri"/>
+        </w:rPr>
+        <w:t xml:space="preserve">. </w:t>
+      </w:r>
+      <w:r>
+        <w:rPr>
+          <w:rFonts w:ascii="Calibri" w:hAnsi="Calibri" w:cs="Calibri"/>
+        </w:rPr>
+        <w:t>A domain goes live only with sign-off from both its domain owner and the CDO. A known defect can be accepted only as a documented exception, with a reason, an owner and a fix-by date, so exceptions don’t quietly become the standard.</w:t>
       </w:r>
     </w:p>
     <w:p>
@@ -4094,6 +5444,1687 @@
           <w:rFonts w:ascii="Calibri" w:hAnsi="Calibri" w:cs="Calibri"/>
         </w:rPr>
       </w:pPr>
+      <w:r>
+        <w:rPr>
+          <w:rFonts w:ascii="Calibri" w:hAnsi="Calibri" w:cs="Calibri"/>
+          <w:b/>
+          <w:bCs/>
+        </w:rPr>
+        <w:t>Environments</w:t>
+      </w:r>
+      <w:r>
+        <w:rPr>
+          <w:rFonts w:ascii="Calibri" w:hAnsi="Calibri" w:cs="Calibri"/>
+        </w:rPr>
+        <w:t xml:space="preserve">. </w:t>
+      </w:r>
+      <w:r>
+        <w:rPr>
+          <w:rFonts w:ascii="Calibri" w:hAnsi="Calibri" w:cs="Calibri"/>
+        </w:rPr>
+        <w:t>Three environments, plus CI as an automated runner:</w:t>
+      </w:r>
+    </w:p>
+    <w:tbl>
+      <w:tblPr>
+        <w:tblStyle w:val="TableGrid"/>
+        <w:tblW w:w="0" w:type="auto"/>
+        <w:tblBorders>
+          <w:top w:val="single" w:sz="4" w:space="0" w:color="D0D8EC"/>
+          <w:left w:val="single" w:sz="4" w:space="0" w:color="D0D8EC"/>
+          <w:bottom w:val="single" w:sz="4" w:space="0" w:color="D0D8EC"/>
+          <w:right w:val="single" w:sz="4" w:space="0" w:color="D0D8EC"/>
+          <w:insideH w:val="single" w:sz="4" w:space="0" w:color="D0D8EC"/>
+          <w:insideV w:val="single" w:sz="4" w:space="0" w:color="D0D8EC"/>
+        </w:tblBorders>
+        <w:tblLook w:val="04A0" w:firstRow="1" w:lastRow="0" w:firstColumn="1" w:lastColumn="0" w:noHBand="0" w:noVBand="1"/>
+      </w:tblPr>
+      <w:tblGrid>
+        <w:gridCol w:w="1696"/>
+        <w:gridCol w:w="3119"/>
+        <w:gridCol w:w="1559"/>
+        <w:gridCol w:w="4082"/>
+      </w:tblGrid>
+      <w:tr>
+        <w:tc>
+          <w:tcPr>
+            <w:tcW w:w="1696" w:type="dxa"/>
+            <w:shd w:val="clear" w:color="auto" w:fill="1A2E5A"/>
+          </w:tcPr>
+          <w:p>
+            <w:pPr>
+              <w:tabs>
+                <w:tab w:val="left" w:pos="1791"/>
+              </w:tabs>
+              <w:rPr>
+                <w:rFonts w:ascii="Calibri" w:hAnsi="Calibri" w:cs="Calibri"/>
+                <w:b/>
+                <w:bCs/>
+                <w:sz w:val="20"/>
+                <w:szCs w:val="20"/>
+              </w:rPr>
+            </w:pPr>
+            <w:r>
+              <w:rPr>
+                <w:rFonts w:ascii="Calibri" w:hAnsi="Calibri" w:cs="Calibri"/>
+                <w:b/>
+                <w:bCs/>
+                <w:sz w:val="20"/>
+                <w:szCs w:val="20"/>
+              </w:rPr>
+              <w:t>Environment</w:t>
+            </w:r>
+          </w:p>
+        </w:tc>
+        <w:tc>
+          <w:tcPr>
+            <w:tcW w:w="3119" w:type="dxa"/>
+            <w:shd w:val="clear" w:color="auto" w:fill="1A2E5A"/>
+          </w:tcPr>
+          <w:p>
+            <w:pPr>
+              <w:tabs>
+                <w:tab w:val="left" w:pos="1791"/>
+              </w:tabs>
+              <w:rPr>
+                <w:rFonts w:ascii="Calibri" w:hAnsi="Calibri" w:cs="Calibri"/>
+                <w:b/>
+                <w:bCs/>
+                <w:sz w:val="20"/>
+                <w:szCs w:val="20"/>
+              </w:rPr>
+            </w:pPr>
+            <w:r>
+              <w:rPr>
+                <w:rFonts w:ascii="Calibri" w:hAnsi="Calibri" w:cs="Calibri"/>
+                <w:b/>
+                <w:bCs/>
+                <w:sz w:val="20"/>
+                <w:szCs w:val="20"/>
+              </w:rPr>
+              <w:t>Platform</w:t>
+            </w:r>
+          </w:p>
+        </w:tc>
+        <w:tc>
+          <w:tcPr>
+            <w:tcW w:w="1559" w:type="dxa"/>
+            <w:shd w:val="clear" w:color="auto" w:fill="1A2E5A"/>
+          </w:tcPr>
+          <w:p>
+            <w:pPr>
+              <w:tabs>
+                <w:tab w:val="left" w:pos="1791"/>
+              </w:tabs>
+              <w:rPr>
+                <w:rFonts w:ascii="Calibri" w:hAnsi="Calibri" w:cs="Calibri"/>
+                <w:b/>
+                <w:bCs/>
+                <w:sz w:val="20"/>
+                <w:szCs w:val="20"/>
+              </w:rPr>
+            </w:pPr>
+            <w:r>
+              <w:rPr>
+                <w:rFonts w:ascii="Calibri" w:hAnsi="Calibri" w:cs="Calibri"/>
+                <w:b/>
+                <w:bCs/>
+                <w:sz w:val="20"/>
+                <w:szCs w:val="20"/>
+              </w:rPr>
+              <w:t>Data</w:t>
+            </w:r>
+          </w:p>
+        </w:tc>
+        <w:tc>
+          <w:tcPr>
+            <w:tcW w:w="4082" w:type="dxa"/>
+            <w:shd w:val="clear" w:color="auto" w:fill="1A2E5A"/>
+          </w:tcPr>
+          <w:p>
+            <w:pPr>
+              <w:tabs>
+                <w:tab w:val="left" w:pos="1791"/>
+              </w:tabs>
+              <w:rPr>
+                <w:rFonts w:ascii="Calibri" w:hAnsi="Calibri" w:cs="Calibri"/>
+                <w:b/>
+                <w:bCs/>
+                <w:sz w:val="20"/>
+                <w:szCs w:val="20"/>
+              </w:rPr>
+            </w:pPr>
+            <w:r>
+              <w:rPr>
+                <w:rFonts w:ascii="Calibri" w:hAnsi="Calibri" w:cs="Calibri"/>
+                <w:b/>
+                <w:bCs/>
+                <w:sz w:val="20"/>
+                <w:szCs w:val="20"/>
+              </w:rPr>
+              <w:t>Purpose</w:t>
+            </w:r>
+          </w:p>
+        </w:tc>
+      </w:tr>
+      <w:tr>
+        <w:tc>
+          <w:tcPr>
+            <w:tcW w:w="1696" w:type="dxa"/>
+          </w:tcPr>
+          <w:p>
+            <w:pPr>
+              <w:tabs>
+                <w:tab w:val="left" w:pos="1791"/>
+              </w:tabs>
+              <w:rPr>
+                <w:rFonts w:ascii="Calibri" w:hAnsi="Calibri" w:cs="Calibri"/>
+                <w:sz w:val="20"/>
+                <w:szCs w:val="20"/>
+              </w:rPr>
+            </w:pPr>
+            <w:r>
+              <w:rPr>
+                <w:rFonts w:ascii="Calibri" w:hAnsi="Calibri" w:cs="Calibri"/>
+                <w:sz w:val="20"/>
+                <w:szCs w:val="20"/>
+              </w:rPr>
+              <w:t>Dev</w:t>
+            </w:r>
+          </w:p>
+        </w:tc>
+        <w:tc>
+          <w:tcPr>
+            <w:tcW w:w="3119" w:type="dxa"/>
+          </w:tcPr>
+          <w:p>
+            <w:pPr>
+              <w:tabs>
+                <w:tab w:val="left" w:pos="1791"/>
+              </w:tabs>
+              <w:rPr>
+                <w:rFonts w:ascii="Calibri" w:hAnsi="Calibri" w:cs="Calibri"/>
+                <w:sz w:val="20"/>
+                <w:szCs w:val="20"/>
+              </w:rPr>
+            </w:pPr>
+            <w:r>
+              <w:rPr>
+                <w:rFonts w:ascii="Calibri" w:hAnsi="Calibri" w:cs="Calibri"/>
+                <w:sz w:val="20"/>
+                <w:szCs w:val="20"/>
+              </w:rPr>
+              <w:t xml:space="preserve">Local </w:t>
+            </w:r>
+            <w:proofErr w:type="spellStart"/>
+            <w:r>
+              <w:rPr>
+                <w:rFonts w:ascii="Calibri" w:hAnsi="Calibri" w:cs="Calibri"/>
+                <w:sz w:val="20"/>
+                <w:szCs w:val="20"/>
+              </w:rPr>
+              <w:t>DuckDB</w:t>
+            </w:r>
+            <w:proofErr w:type="spellEnd"/>
+          </w:p>
+        </w:tc>
+        <w:tc>
+          <w:tcPr>
+            <w:tcW w:w="1559" w:type="dxa"/>
+          </w:tcPr>
+          <w:p>
+            <w:pPr>
+              <w:tabs>
+                <w:tab w:val="left" w:pos="1791"/>
+              </w:tabs>
+              <w:rPr>
+                <w:rFonts w:ascii="Calibri" w:hAnsi="Calibri" w:cs="Calibri"/>
+                <w:sz w:val="20"/>
+                <w:szCs w:val="20"/>
+              </w:rPr>
+            </w:pPr>
+            <w:r>
+              <w:rPr>
+                <w:rFonts w:ascii="Calibri" w:hAnsi="Calibri" w:cs="Calibri"/>
+                <w:sz w:val="20"/>
+                <w:szCs w:val="20"/>
+              </w:rPr>
+              <w:t>Synthetic</w:t>
+            </w:r>
+          </w:p>
+        </w:tc>
+        <w:tc>
+          <w:tcPr>
+            <w:tcW w:w="4082" w:type="dxa"/>
+          </w:tcPr>
+          <w:p>
+            <w:pPr>
+              <w:tabs>
+                <w:tab w:val="left" w:pos="1791"/>
+              </w:tabs>
+              <w:rPr>
+                <w:rFonts w:ascii="Calibri" w:hAnsi="Calibri" w:cs="Calibri"/>
+                <w:sz w:val="20"/>
+                <w:szCs w:val="20"/>
+              </w:rPr>
+            </w:pPr>
+            <w:r>
+              <w:rPr>
+                <w:rFonts w:ascii="Calibri" w:hAnsi="Calibri" w:cs="Calibri"/>
+                <w:sz w:val="20"/>
+                <w:szCs w:val="20"/>
+              </w:rPr>
+              <w:t>Building models, unit tests, planted-defect testing</w:t>
+            </w:r>
+          </w:p>
+        </w:tc>
+      </w:tr>
+      <w:tr>
+        <w:tc>
+          <w:tcPr>
+            <w:tcW w:w="1696" w:type="dxa"/>
+            <w:shd w:val="clear" w:color="auto" w:fill="EEF1F8"/>
+          </w:tcPr>
+          <w:p>
+            <w:pPr>
+              <w:tabs>
+                <w:tab w:val="left" w:pos="1791"/>
+              </w:tabs>
+              <w:rPr>
+                <w:rFonts w:ascii="Calibri" w:hAnsi="Calibri" w:cs="Calibri"/>
+                <w:sz w:val="20"/>
+                <w:szCs w:val="20"/>
+              </w:rPr>
+            </w:pPr>
+            <w:r>
+              <w:rPr>
+                <w:rFonts w:ascii="Calibri" w:hAnsi="Calibri" w:cs="Calibri"/>
+                <w:sz w:val="20"/>
+                <w:szCs w:val="20"/>
+              </w:rPr>
+              <w:t>Test\UAT</w:t>
+            </w:r>
+          </w:p>
+        </w:tc>
+        <w:tc>
+          <w:tcPr>
+            <w:tcW w:w="3119" w:type="dxa"/>
+            <w:shd w:val="clear" w:color="auto" w:fill="EEF1F8"/>
+          </w:tcPr>
+          <w:p>
+            <w:pPr>
+              <w:tabs>
+                <w:tab w:val="left" w:pos="1791"/>
+              </w:tabs>
+              <w:rPr>
+                <w:rFonts w:ascii="Calibri" w:hAnsi="Calibri" w:cs="Calibri"/>
+                <w:sz w:val="20"/>
+                <w:szCs w:val="20"/>
+              </w:rPr>
+            </w:pPr>
+            <w:r>
+              <w:rPr>
+                <w:rFonts w:ascii="Calibri" w:hAnsi="Calibri" w:cs="Calibri"/>
+                <w:sz w:val="20"/>
+                <w:szCs w:val="20"/>
+              </w:rPr>
+              <w:t>Fabric workspace</w:t>
+            </w:r>
+          </w:p>
+        </w:tc>
+        <w:tc>
+          <w:tcPr>
+            <w:tcW w:w="1559" w:type="dxa"/>
+            <w:shd w:val="clear" w:color="auto" w:fill="EEF1F8"/>
+          </w:tcPr>
+          <w:p>
+            <w:pPr>
+              <w:tabs>
+                <w:tab w:val="left" w:pos="1791"/>
+              </w:tabs>
+              <w:rPr>
+                <w:rFonts w:ascii="Calibri" w:hAnsi="Calibri" w:cs="Calibri"/>
+                <w:sz w:val="20"/>
+                <w:szCs w:val="20"/>
+              </w:rPr>
+            </w:pPr>
+            <w:r>
+              <w:rPr>
+                <w:rFonts w:ascii="Calibri" w:hAnsi="Calibri" w:cs="Calibri"/>
+                <w:sz w:val="20"/>
+                <w:szCs w:val="20"/>
+              </w:rPr>
+              <w:t>Synthetic or masked, per section 7</w:t>
+            </w:r>
+          </w:p>
+        </w:tc>
+        <w:tc>
+          <w:tcPr>
+            <w:tcW w:w="4082" w:type="dxa"/>
+            <w:shd w:val="clear" w:color="auto" w:fill="EEF1F8"/>
+          </w:tcPr>
+          <w:p>
+            <w:pPr>
+              <w:tabs>
+                <w:tab w:val="left" w:pos="1791"/>
+              </w:tabs>
+              <w:rPr>
+                <w:rFonts w:ascii="Calibri" w:hAnsi="Calibri" w:cs="Calibri"/>
+                <w:sz w:val="20"/>
+                <w:szCs w:val="20"/>
+              </w:rPr>
+            </w:pPr>
+            <w:r>
+              <w:rPr>
+                <w:rFonts w:ascii="Calibri" w:hAnsi="Calibri" w:cs="Calibri"/>
+                <w:sz w:val="20"/>
+                <w:szCs w:val="20"/>
+              </w:rPr>
+              <w:t>Integration on the real platform, live reconciliation, business UAT</w:t>
+            </w:r>
+          </w:p>
+        </w:tc>
+      </w:tr>
+      <w:tr>
+        <w:tc>
+          <w:tcPr>
+            <w:tcW w:w="1696" w:type="dxa"/>
+          </w:tcPr>
+          <w:p>
+            <w:pPr>
+              <w:tabs>
+                <w:tab w:val="left" w:pos="1791"/>
+              </w:tabs>
+              <w:rPr>
+                <w:rFonts w:ascii="Calibri" w:hAnsi="Calibri" w:cs="Calibri"/>
+                <w:sz w:val="20"/>
+                <w:szCs w:val="20"/>
+              </w:rPr>
+            </w:pPr>
+            <w:r>
+              <w:rPr>
+                <w:rFonts w:ascii="Calibri" w:hAnsi="Calibri" w:cs="Calibri"/>
+                <w:sz w:val="20"/>
+                <w:szCs w:val="20"/>
+              </w:rPr>
+              <w:t>Production</w:t>
+            </w:r>
+          </w:p>
+        </w:tc>
+        <w:tc>
+          <w:tcPr>
+            <w:tcW w:w="3119" w:type="dxa"/>
+          </w:tcPr>
+          <w:p>
+            <w:pPr>
+              <w:tabs>
+                <w:tab w:val="left" w:pos="1791"/>
+              </w:tabs>
+              <w:rPr>
+                <w:rFonts w:ascii="Calibri" w:hAnsi="Calibri" w:cs="Calibri"/>
+                <w:sz w:val="20"/>
+                <w:szCs w:val="20"/>
+              </w:rPr>
+            </w:pPr>
+            <w:r>
+              <w:rPr>
+                <w:rFonts w:ascii="Calibri" w:hAnsi="Calibri" w:cs="Calibri"/>
+                <w:sz w:val="20"/>
+                <w:szCs w:val="20"/>
+              </w:rPr>
+              <w:t>Fabric workspace</w:t>
+            </w:r>
+          </w:p>
+        </w:tc>
+        <w:tc>
+          <w:tcPr>
+            <w:tcW w:w="1559" w:type="dxa"/>
+          </w:tcPr>
+          <w:p>
+            <w:pPr>
+              <w:tabs>
+                <w:tab w:val="left" w:pos="1791"/>
+              </w:tabs>
+              <w:rPr>
+                <w:rFonts w:ascii="Calibri" w:hAnsi="Calibri" w:cs="Calibri"/>
+                <w:sz w:val="20"/>
+                <w:szCs w:val="20"/>
+              </w:rPr>
+            </w:pPr>
+            <w:r>
+              <w:rPr>
+                <w:rFonts w:ascii="Calibri" w:hAnsi="Calibri" w:cs="Calibri"/>
+                <w:sz w:val="20"/>
+                <w:szCs w:val="20"/>
+              </w:rPr>
+              <w:t>Real (portfolio: synthetic)</w:t>
+            </w:r>
+          </w:p>
+        </w:tc>
+        <w:tc>
+          <w:tcPr>
+            <w:tcW w:w="4082" w:type="dxa"/>
+          </w:tcPr>
+          <w:p>
+            <w:pPr>
+              <w:tabs>
+                <w:tab w:val="left" w:pos="1791"/>
+              </w:tabs>
+              <w:rPr>
+                <w:rFonts w:ascii="Calibri" w:hAnsi="Calibri" w:cs="Calibri"/>
+                <w:sz w:val="20"/>
+                <w:szCs w:val="20"/>
+              </w:rPr>
+            </w:pPr>
+            <w:r>
+              <w:rPr>
+                <w:rFonts w:ascii="Calibri" w:hAnsi="Calibri" w:cs="Calibri"/>
+                <w:sz w:val="20"/>
+                <w:szCs w:val="20"/>
+              </w:rPr>
+              <w:t>Live platform, built at Step 18</w:t>
+            </w:r>
+          </w:p>
+        </w:tc>
+      </w:tr>
+      <w:tr>
+        <w:tc>
+          <w:tcPr>
+            <w:tcW w:w="1696" w:type="dxa"/>
+            <w:shd w:val="clear" w:color="auto" w:fill="EEF1F8"/>
+          </w:tcPr>
+          <w:p>
+            <w:pPr>
+              <w:tabs>
+                <w:tab w:val="left" w:pos="1791"/>
+              </w:tabs>
+              <w:rPr>
+                <w:rFonts w:ascii="Calibri" w:hAnsi="Calibri" w:cs="Calibri"/>
+                <w:sz w:val="20"/>
+                <w:szCs w:val="20"/>
+              </w:rPr>
+            </w:pPr>
+            <w:r>
+              <w:rPr>
+                <w:rFonts w:ascii="Calibri" w:hAnsi="Calibri" w:cs="Calibri"/>
+                <w:sz w:val="20"/>
+                <w:szCs w:val="20"/>
+              </w:rPr>
+              <w:t>CI (runner)</w:t>
+            </w:r>
+          </w:p>
+        </w:tc>
+        <w:tc>
+          <w:tcPr>
+            <w:tcW w:w="3119" w:type="dxa"/>
+            <w:shd w:val="clear" w:color="auto" w:fill="EEF1F8"/>
+          </w:tcPr>
+          <w:p>
+            <w:pPr>
+              <w:tabs>
+                <w:tab w:val="left" w:pos="1791"/>
+              </w:tabs>
+              <w:rPr>
+                <w:rFonts w:ascii="Calibri" w:hAnsi="Calibri" w:cs="Calibri"/>
+                <w:sz w:val="20"/>
+                <w:szCs w:val="20"/>
+              </w:rPr>
+            </w:pPr>
+            <w:r>
+              <w:rPr>
+                <w:rFonts w:ascii="Calibri" w:hAnsi="Calibri" w:cs="Calibri"/>
+                <w:sz w:val="20"/>
+                <w:szCs w:val="20"/>
+              </w:rPr>
+              <w:t>GitHub Actions</w:t>
+            </w:r>
+          </w:p>
+        </w:tc>
+        <w:tc>
+          <w:tcPr>
+            <w:tcW w:w="1559" w:type="dxa"/>
+            <w:shd w:val="clear" w:color="auto" w:fill="EEF1F8"/>
+          </w:tcPr>
+          <w:p>
+            <w:pPr>
+              <w:tabs>
+                <w:tab w:val="left" w:pos="1791"/>
+              </w:tabs>
+              <w:rPr>
+                <w:rFonts w:ascii="Calibri" w:hAnsi="Calibri" w:cs="Calibri"/>
+                <w:sz w:val="20"/>
+                <w:szCs w:val="20"/>
+              </w:rPr>
+            </w:pPr>
+            <w:r>
+              <w:rPr>
+                <w:rFonts w:ascii="Calibri" w:hAnsi="Calibri" w:cs="Calibri"/>
+                <w:sz w:val="20"/>
+                <w:szCs w:val="20"/>
+              </w:rPr>
+              <w:t>Synthetic</w:t>
+            </w:r>
+          </w:p>
+        </w:tc>
+        <w:tc>
+          <w:tcPr>
+            <w:tcW w:w="4082" w:type="dxa"/>
+            <w:shd w:val="clear" w:color="auto" w:fill="EEF1F8"/>
+          </w:tcPr>
+          <w:p>
+            <w:pPr>
+              <w:tabs>
+                <w:tab w:val="left" w:pos="1791"/>
+              </w:tabs>
+              <w:rPr>
+                <w:rFonts w:ascii="Calibri" w:hAnsi="Calibri" w:cs="Calibri"/>
+                <w:sz w:val="20"/>
+                <w:szCs w:val="20"/>
+              </w:rPr>
+            </w:pPr>
+            <w:r>
+              <w:rPr>
+                <w:rFonts w:ascii="Calibri" w:hAnsi="Calibri" w:cs="Calibri"/>
+                <w:sz w:val="20"/>
+                <w:szCs w:val="20"/>
+              </w:rPr>
+              <w:t>Documentation gate and unit tests on every pull request</w:t>
+            </w:r>
+          </w:p>
+        </w:tc>
+      </w:tr>
+    </w:tbl>
+    <w:p>
+      <w:pPr>
+        <w:tabs>
+          <w:tab w:val="left" w:pos="1791"/>
+        </w:tabs>
+        <w:rPr>
+          <w:rFonts w:ascii="Calibri" w:hAnsi="Calibri" w:cs="Calibri"/>
+        </w:rPr>
+      </w:pPr>
+    </w:p>
+    <w:p>
+      <w:pPr>
+        <w:tabs>
+          <w:tab w:val="left" w:pos="1791"/>
+        </w:tabs>
+        <w:rPr>
+          <w:rFonts w:ascii="Calibri" w:hAnsi="Calibri" w:cs="Calibri"/>
+        </w:rPr>
+      </w:pPr>
+      <w:r>
+        <w:rPr>
+          <w:rFonts w:ascii="Calibri" w:hAnsi="Calibri" w:cs="Calibri"/>
+        </w:rPr>
+        <w:t>The same dbt project serves all environments through dbt targets; no code changes between them.</w:t>
+      </w:r>
+    </w:p>
+    <w:p>
+      <w:pPr>
+        <w:tabs>
+          <w:tab w:val="left" w:pos="1791"/>
+        </w:tabs>
+        <w:rPr>
+          <w:rFonts w:ascii="Calibri" w:hAnsi="Calibri" w:cs="Calibri"/>
+          <w:b/>
+          <w:bCs/>
+        </w:rPr>
+      </w:pPr>
+      <w:r>
+        <w:rPr>
+          <w:rFonts w:ascii="Calibri" w:hAnsi="Calibri" w:cs="Calibri"/>
+          <w:b/>
+          <w:bCs/>
+        </w:rPr>
+        <w:t>Which tests run where.</w:t>
+      </w:r>
+    </w:p>
+    <w:tbl>
+      <w:tblPr>
+        <w:tblStyle w:val="TableGrid"/>
+        <w:tblW w:w="0" w:type="auto"/>
+        <w:tblBorders>
+          <w:top w:val="single" w:sz="4" w:space="0" w:color="D0D8EC"/>
+          <w:left w:val="single" w:sz="4" w:space="0" w:color="D0D8EC"/>
+          <w:bottom w:val="single" w:sz="4" w:space="0" w:color="D0D8EC"/>
+          <w:right w:val="single" w:sz="4" w:space="0" w:color="D0D8EC"/>
+          <w:insideH w:val="single" w:sz="4" w:space="0" w:color="D0D8EC"/>
+          <w:insideV w:val="single" w:sz="4" w:space="0" w:color="D0D8EC"/>
+        </w:tblBorders>
+        <w:tblLook w:val="04A0" w:firstRow="1" w:lastRow="0" w:firstColumn="1" w:lastColumn="0" w:noHBand="0" w:noVBand="1"/>
+      </w:tblPr>
+      <w:tblGrid>
+        <w:gridCol w:w="2091"/>
+        <w:gridCol w:w="2091"/>
+        <w:gridCol w:w="2091"/>
+        <w:gridCol w:w="2091"/>
+        <w:gridCol w:w="2092"/>
+      </w:tblGrid>
+      <w:tr>
+        <w:tc>
+          <w:tcPr>
+            <w:tcW w:w="2091" w:type="dxa"/>
+            <w:shd w:val="clear" w:color="auto" w:fill="1A2E5A"/>
+          </w:tcPr>
+          <w:p>
+            <w:pPr>
+              <w:tabs>
+                <w:tab w:val="left" w:pos="1791"/>
+              </w:tabs>
+              <w:rPr>
+                <w:rFonts w:ascii="Calibri" w:hAnsi="Calibri" w:cs="Calibri"/>
+                <w:b/>
+                <w:bCs/>
+                <w:sz w:val="20"/>
+                <w:szCs w:val="20"/>
+              </w:rPr>
+            </w:pPr>
+            <w:r>
+              <w:rPr>
+                <w:rFonts w:ascii="Calibri" w:hAnsi="Calibri" w:cs="Calibri"/>
+                <w:b/>
+                <w:bCs/>
+                <w:sz w:val="20"/>
+                <w:szCs w:val="20"/>
+              </w:rPr>
+              <w:t>Test type</w:t>
+            </w:r>
+          </w:p>
+        </w:tc>
+        <w:tc>
+          <w:tcPr>
+            <w:tcW w:w="2091" w:type="dxa"/>
+            <w:shd w:val="clear" w:color="auto" w:fill="1A2E5A"/>
+          </w:tcPr>
+          <w:p>
+            <w:pPr>
+              <w:tabs>
+                <w:tab w:val="left" w:pos="1791"/>
+              </w:tabs>
+              <w:rPr>
+                <w:rFonts w:ascii="Calibri" w:hAnsi="Calibri" w:cs="Calibri"/>
+                <w:b/>
+                <w:bCs/>
+                <w:sz w:val="20"/>
+                <w:szCs w:val="20"/>
+              </w:rPr>
+            </w:pPr>
+            <w:r>
+              <w:rPr>
+                <w:rFonts w:ascii="Calibri" w:hAnsi="Calibri" w:cs="Calibri"/>
+                <w:b/>
+                <w:bCs/>
+                <w:sz w:val="20"/>
+                <w:szCs w:val="20"/>
+              </w:rPr>
+              <w:t>Dev</w:t>
+            </w:r>
+          </w:p>
+        </w:tc>
+        <w:tc>
+          <w:tcPr>
+            <w:tcW w:w="2091" w:type="dxa"/>
+            <w:shd w:val="clear" w:color="auto" w:fill="1A2E5A"/>
+          </w:tcPr>
+          <w:p>
+            <w:pPr>
+              <w:tabs>
+                <w:tab w:val="left" w:pos="1791"/>
+              </w:tabs>
+              <w:rPr>
+                <w:rFonts w:ascii="Calibri" w:hAnsi="Calibri" w:cs="Calibri"/>
+                <w:b/>
+                <w:bCs/>
+                <w:sz w:val="20"/>
+                <w:szCs w:val="20"/>
+              </w:rPr>
+            </w:pPr>
+            <w:r>
+              <w:rPr>
+                <w:rFonts w:ascii="Calibri" w:hAnsi="Calibri" w:cs="Calibri"/>
+                <w:b/>
+                <w:bCs/>
+                <w:sz w:val="20"/>
+                <w:szCs w:val="20"/>
+              </w:rPr>
+              <w:t>CI</w:t>
+            </w:r>
+          </w:p>
+        </w:tc>
+        <w:tc>
+          <w:tcPr>
+            <w:tcW w:w="2091" w:type="dxa"/>
+            <w:shd w:val="clear" w:color="auto" w:fill="1A2E5A"/>
+          </w:tcPr>
+          <w:p>
+            <w:pPr>
+              <w:tabs>
+                <w:tab w:val="left" w:pos="1791"/>
+              </w:tabs>
+              <w:rPr>
+                <w:rFonts w:ascii="Calibri" w:hAnsi="Calibri" w:cs="Calibri"/>
+                <w:b/>
+                <w:bCs/>
+                <w:sz w:val="20"/>
+                <w:szCs w:val="20"/>
+              </w:rPr>
+            </w:pPr>
+            <w:r>
+              <w:rPr>
+                <w:rFonts w:ascii="Calibri" w:hAnsi="Calibri" w:cs="Calibri"/>
+                <w:b/>
+                <w:bCs/>
+                <w:sz w:val="20"/>
+                <w:szCs w:val="20"/>
+              </w:rPr>
+              <w:t>Test\UAT</w:t>
+            </w:r>
+          </w:p>
+        </w:tc>
+        <w:tc>
+          <w:tcPr>
+            <w:tcW w:w="2092" w:type="dxa"/>
+            <w:shd w:val="clear" w:color="auto" w:fill="1A2E5A"/>
+          </w:tcPr>
+          <w:p>
+            <w:pPr>
+              <w:tabs>
+                <w:tab w:val="left" w:pos="1791"/>
+              </w:tabs>
+              <w:rPr>
+                <w:rFonts w:ascii="Calibri" w:hAnsi="Calibri" w:cs="Calibri"/>
+                <w:b/>
+                <w:bCs/>
+                <w:sz w:val="20"/>
+                <w:szCs w:val="20"/>
+              </w:rPr>
+            </w:pPr>
+            <w:r>
+              <w:rPr>
+                <w:rFonts w:ascii="Calibri" w:hAnsi="Calibri" w:cs="Calibri"/>
+                <w:b/>
+                <w:bCs/>
+                <w:sz w:val="20"/>
+                <w:szCs w:val="20"/>
+              </w:rPr>
+              <w:t>Production</w:t>
+            </w:r>
+          </w:p>
+        </w:tc>
+      </w:tr>
+      <w:tr>
+        <w:tc>
+          <w:tcPr>
+            <w:tcW w:w="2091" w:type="dxa"/>
+          </w:tcPr>
+          <w:p>
+            <w:pPr>
+              <w:tabs>
+                <w:tab w:val="left" w:pos="1791"/>
+              </w:tabs>
+              <w:rPr>
+                <w:rFonts w:ascii="Calibri" w:hAnsi="Calibri" w:cs="Calibri"/>
+                <w:sz w:val="20"/>
+                <w:szCs w:val="20"/>
+              </w:rPr>
+            </w:pPr>
+            <w:r>
+              <w:rPr>
+                <w:rFonts w:ascii="Calibri" w:hAnsi="Calibri" w:cs="Calibri"/>
+                <w:sz w:val="20"/>
+                <w:szCs w:val="20"/>
+              </w:rPr>
+              <w:t>Data tests sec.3</w:t>
+            </w:r>
+          </w:p>
+        </w:tc>
+        <w:tc>
+          <w:tcPr>
+            <w:tcW w:w="2091" w:type="dxa"/>
+          </w:tcPr>
+          <w:p>
+            <w:pPr>
+              <w:tabs>
+                <w:tab w:val="left" w:pos="1791"/>
+              </w:tabs>
+              <w:rPr>
+                <w:rFonts w:ascii="Calibri" w:hAnsi="Calibri" w:cs="Calibri"/>
+                <w:sz w:val="20"/>
+                <w:szCs w:val="20"/>
+              </w:rPr>
+            </w:pPr>
+            <w:r>
+              <w:rPr>
+                <w:rFonts w:ascii="Calibri" w:hAnsi="Calibri" w:cs="Calibri"/>
+                <w:sz w:val="20"/>
+                <w:szCs w:val="20"/>
+              </w:rPr>
+              <w:t>Yes</w:t>
+            </w:r>
+          </w:p>
+        </w:tc>
+        <w:tc>
+          <w:tcPr>
+            <w:tcW w:w="2091" w:type="dxa"/>
+          </w:tcPr>
+          <w:p>
+            <w:pPr>
+              <w:tabs>
+                <w:tab w:val="left" w:pos="1791"/>
+              </w:tabs>
+              <w:rPr>
+                <w:rFonts w:ascii="Calibri" w:hAnsi="Calibri" w:cs="Calibri"/>
+                <w:sz w:val="20"/>
+                <w:szCs w:val="20"/>
+              </w:rPr>
+            </w:pPr>
+            <w:r>
+              <w:rPr>
+                <w:rFonts w:ascii="Calibri" w:hAnsi="Calibri" w:cs="Calibri"/>
+                <w:sz w:val="20"/>
+                <w:szCs w:val="20"/>
+              </w:rPr>
+              <w:t>Yes</w:t>
+            </w:r>
+          </w:p>
+        </w:tc>
+        <w:tc>
+          <w:tcPr>
+            <w:tcW w:w="2091" w:type="dxa"/>
+          </w:tcPr>
+          <w:p>
+            <w:pPr>
+              <w:tabs>
+                <w:tab w:val="left" w:pos="1791"/>
+              </w:tabs>
+              <w:rPr>
+                <w:rFonts w:ascii="Calibri" w:hAnsi="Calibri" w:cs="Calibri"/>
+                <w:sz w:val="20"/>
+                <w:szCs w:val="20"/>
+              </w:rPr>
+            </w:pPr>
+            <w:r>
+              <w:rPr>
+                <w:rFonts w:ascii="Calibri" w:hAnsi="Calibri" w:cs="Calibri"/>
+                <w:sz w:val="20"/>
+                <w:szCs w:val="20"/>
+              </w:rPr>
+              <w:t>Yes</w:t>
+            </w:r>
+          </w:p>
+        </w:tc>
+        <w:tc>
+          <w:tcPr>
+            <w:tcW w:w="2092" w:type="dxa"/>
+          </w:tcPr>
+          <w:p>
+            <w:pPr>
+              <w:tabs>
+                <w:tab w:val="left" w:pos="1791"/>
+              </w:tabs>
+              <w:rPr>
+                <w:rFonts w:ascii="Calibri" w:hAnsi="Calibri" w:cs="Calibri"/>
+                <w:sz w:val="20"/>
+                <w:szCs w:val="20"/>
+              </w:rPr>
+            </w:pPr>
+            <w:r>
+              <w:rPr>
+                <w:rFonts w:ascii="Calibri" w:hAnsi="Calibri" w:cs="Calibri"/>
+                <w:sz w:val="20"/>
+                <w:szCs w:val="20"/>
+              </w:rPr>
+              <w:t>Yes</w:t>
+            </w:r>
+          </w:p>
+        </w:tc>
+      </w:tr>
+      <w:tr>
+        <w:tc>
+          <w:tcPr>
+            <w:tcW w:w="2091" w:type="dxa"/>
+            <w:shd w:val="clear" w:color="auto" w:fill="EEF1F8"/>
+          </w:tcPr>
+          <w:p>
+            <w:pPr>
+              <w:tabs>
+                <w:tab w:val="left" w:pos="1791"/>
+              </w:tabs>
+              <w:rPr>
+                <w:rFonts w:ascii="Calibri" w:hAnsi="Calibri" w:cs="Calibri"/>
+                <w:sz w:val="20"/>
+                <w:szCs w:val="20"/>
+              </w:rPr>
+            </w:pPr>
+            <w:r>
+              <w:rPr>
+                <w:rFonts w:ascii="Calibri" w:hAnsi="Calibri" w:cs="Calibri"/>
+                <w:sz w:val="20"/>
+                <w:szCs w:val="20"/>
+              </w:rPr>
+              <w:lastRenderedPageBreak/>
+              <w:t>Unit tests sec.4</w:t>
+            </w:r>
+          </w:p>
+        </w:tc>
+        <w:tc>
+          <w:tcPr>
+            <w:tcW w:w="2091" w:type="dxa"/>
+            <w:shd w:val="clear" w:color="auto" w:fill="EEF1F8"/>
+          </w:tcPr>
+          <w:p>
+            <w:pPr>
+              <w:tabs>
+                <w:tab w:val="left" w:pos="1791"/>
+              </w:tabs>
+              <w:rPr>
+                <w:rFonts w:ascii="Calibri" w:hAnsi="Calibri" w:cs="Calibri"/>
+                <w:sz w:val="20"/>
+                <w:szCs w:val="20"/>
+              </w:rPr>
+            </w:pPr>
+            <w:r>
+              <w:rPr>
+                <w:rFonts w:ascii="Calibri" w:hAnsi="Calibri" w:cs="Calibri"/>
+                <w:sz w:val="20"/>
+                <w:szCs w:val="20"/>
+              </w:rPr>
+              <w:t>Yes</w:t>
+            </w:r>
+          </w:p>
+        </w:tc>
+        <w:tc>
+          <w:tcPr>
+            <w:tcW w:w="2091" w:type="dxa"/>
+            <w:shd w:val="clear" w:color="auto" w:fill="EEF1F8"/>
+          </w:tcPr>
+          <w:p>
+            <w:pPr>
+              <w:tabs>
+                <w:tab w:val="left" w:pos="1791"/>
+              </w:tabs>
+              <w:rPr>
+                <w:rFonts w:ascii="Calibri" w:hAnsi="Calibri" w:cs="Calibri"/>
+                <w:sz w:val="20"/>
+                <w:szCs w:val="20"/>
+              </w:rPr>
+            </w:pPr>
+            <w:r>
+              <w:rPr>
+                <w:rFonts w:ascii="Calibri" w:hAnsi="Calibri" w:cs="Calibri"/>
+                <w:sz w:val="20"/>
+                <w:szCs w:val="20"/>
+              </w:rPr>
+              <w:t>Yes</w:t>
+            </w:r>
+          </w:p>
+        </w:tc>
+        <w:tc>
+          <w:tcPr>
+            <w:tcW w:w="2091" w:type="dxa"/>
+            <w:shd w:val="clear" w:color="auto" w:fill="EEF1F8"/>
+          </w:tcPr>
+          <w:p>
+            <w:pPr>
+              <w:tabs>
+                <w:tab w:val="left" w:pos="1791"/>
+              </w:tabs>
+              <w:rPr>
+                <w:rFonts w:ascii="Calibri" w:hAnsi="Calibri" w:cs="Calibri"/>
+                <w:sz w:val="20"/>
+                <w:szCs w:val="20"/>
+              </w:rPr>
+            </w:pPr>
+            <w:r>
+              <w:rPr>
+                <w:rFonts w:ascii="Calibri" w:hAnsi="Calibri" w:cs="Calibri"/>
+                <w:sz w:val="20"/>
+                <w:szCs w:val="20"/>
+              </w:rPr>
+              <w:t>No</w:t>
+            </w:r>
+          </w:p>
+        </w:tc>
+        <w:tc>
+          <w:tcPr>
+            <w:tcW w:w="2092" w:type="dxa"/>
+            <w:shd w:val="clear" w:color="auto" w:fill="EEF1F8"/>
+          </w:tcPr>
+          <w:p>
+            <w:pPr>
+              <w:tabs>
+                <w:tab w:val="left" w:pos="1791"/>
+              </w:tabs>
+              <w:rPr>
+                <w:rFonts w:ascii="Calibri" w:hAnsi="Calibri" w:cs="Calibri"/>
+                <w:sz w:val="20"/>
+                <w:szCs w:val="20"/>
+              </w:rPr>
+            </w:pPr>
+            <w:r>
+              <w:rPr>
+                <w:rFonts w:ascii="Calibri" w:hAnsi="Calibri" w:cs="Calibri"/>
+                <w:sz w:val="20"/>
+                <w:szCs w:val="20"/>
+              </w:rPr>
+              <w:t>No</w:t>
+            </w:r>
+          </w:p>
+        </w:tc>
+      </w:tr>
+      <w:tr>
+        <w:tc>
+          <w:tcPr>
+            <w:tcW w:w="2091" w:type="dxa"/>
+          </w:tcPr>
+          <w:p>
+            <w:pPr>
+              <w:tabs>
+                <w:tab w:val="left" w:pos="1791"/>
+              </w:tabs>
+              <w:rPr>
+                <w:rFonts w:ascii="Calibri" w:hAnsi="Calibri" w:cs="Calibri"/>
+                <w:sz w:val="20"/>
+                <w:szCs w:val="20"/>
+              </w:rPr>
+            </w:pPr>
+            <w:r>
+              <w:rPr>
+                <w:rFonts w:ascii="Calibri" w:hAnsi="Calibri" w:cs="Calibri"/>
+                <w:sz w:val="20"/>
+                <w:szCs w:val="20"/>
+              </w:rPr>
+              <w:t>Reconciliation, planted defects sec.5</w:t>
+            </w:r>
+          </w:p>
+        </w:tc>
+        <w:tc>
+          <w:tcPr>
+            <w:tcW w:w="2091" w:type="dxa"/>
+          </w:tcPr>
+          <w:p>
+            <w:pPr>
+              <w:tabs>
+                <w:tab w:val="left" w:pos="1791"/>
+              </w:tabs>
+              <w:rPr>
+                <w:rFonts w:ascii="Calibri" w:hAnsi="Calibri" w:cs="Calibri"/>
+                <w:sz w:val="20"/>
+                <w:szCs w:val="20"/>
+              </w:rPr>
+            </w:pPr>
+            <w:r>
+              <w:rPr>
+                <w:rFonts w:ascii="Calibri" w:hAnsi="Calibri" w:cs="Calibri"/>
+                <w:sz w:val="20"/>
+                <w:szCs w:val="20"/>
+              </w:rPr>
+              <w:t>Yes</w:t>
+            </w:r>
+          </w:p>
+        </w:tc>
+        <w:tc>
+          <w:tcPr>
+            <w:tcW w:w="2091" w:type="dxa"/>
+          </w:tcPr>
+          <w:p>
+            <w:pPr>
+              <w:tabs>
+                <w:tab w:val="left" w:pos="1791"/>
+              </w:tabs>
+              <w:rPr>
+                <w:rFonts w:ascii="Calibri" w:hAnsi="Calibri" w:cs="Calibri"/>
+                <w:sz w:val="20"/>
+                <w:szCs w:val="20"/>
+              </w:rPr>
+            </w:pPr>
+            <w:r>
+              <w:rPr>
+                <w:rFonts w:ascii="Calibri" w:hAnsi="Calibri" w:cs="Calibri"/>
+                <w:sz w:val="20"/>
+                <w:szCs w:val="20"/>
+              </w:rPr>
+              <w:t>No</w:t>
+            </w:r>
+          </w:p>
+        </w:tc>
+        <w:tc>
+          <w:tcPr>
+            <w:tcW w:w="2091" w:type="dxa"/>
+          </w:tcPr>
+          <w:p>
+            <w:pPr>
+              <w:tabs>
+                <w:tab w:val="left" w:pos="1791"/>
+              </w:tabs>
+              <w:rPr>
+                <w:rFonts w:ascii="Calibri" w:hAnsi="Calibri" w:cs="Calibri"/>
+                <w:sz w:val="20"/>
+                <w:szCs w:val="20"/>
+              </w:rPr>
+            </w:pPr>
+            <w:r>
+              <w:rPr>
+                <w:rFonts w:ascii="Calibri" w:hAnsi="Calibri" w:cs="Calibri"/>
+                <w:sz w:val="20"/>
+                <w:szCs w:val="20"/>
+              </w:rPr>
+              <w:t>Yes, proving run only</w:t>
+            </w:r>
+          </w:p>
+        </w:tc>
+        <w:tc>
+          <w:tcPr>
+            <w:tcW w:w="2092" w:type="dxa"/>
+          </w:tcPr>
+          <w:p>
+            <w:pPr>
+              <w:tabs>
+                <w:tab w:val="left" w:pos="1791"/>
+              </w:tabs>
+              <w:rPr>
+                <w:rFonts w:ascii="Calibri" w:hAnsi="Calibri" w:cs="Calibri"/>
+                <w:sz w:val="20"/>
+                <w:szCs w:val="20"/>
+              </w:rPr>
+            </w:pPr>
+            <w:r>
+              <w:rPr>
+                <w:rFonts w:ascii="Calibri" w:hAnsi="Calibri" w:cs="Calibri"/>
+                <w:sz w:val="20"/>
+                <w:szCs w:val="20"/>
+              </w:rPr>
+              <w:t>No</w:t>
+            </w:r>
+          </w:p>
+        </w:tc>
+      </w:tr>
+      <w:tr>
+        <w:tc>
+          <w:tcPr>
+            <w:tcW w:w="2091" w:type="dxa"/>
+            <w:shd w:val="clear" w:color="auto" w:fill="EEF1F8"/>
+          </w:tcPr>
+          <w:p>
+            <w:pPr>
+              <w:tabs>
+                <w:tab w:val="left" w:pos="1791"/>
+              </w:tabs>
+              <w:rPr>
+                <w:rFonts w:ascii="Calibri" w:hAnsi="Calibri" w:cs="Calibri"/>
+                <w:sz w:val="20"/>
+                <w:szCs w:val="20"/>
+              </w:rPr>
+            </w:pPr>
+            <w:r>
+              <w:rPr>
+                <w:rFonts w:ascii="Calibri" w:hAnsi="Calibri" w:cs="Calibri"/>
+                <w:sz w:val="20"/>
+                <w:szCs w:val="20"/>
+              </w:rPr>
+              <w:t>Reconciliation, live controls (DID-001 sec.7)</w:t>
+            </w:r>
+          </w:p>
+        </w:tc>
+        <w:tc>
+          <w:tcPr>
+            <w:tcW w:w="2091" w:type="dxa"/>
+            <w:shd w:val="clear" w:color="auto" w:fill="EEF1F8"/>
+          </w:tcPr>
+          <w:p>
+            <w:pPr>
+              <w:tabs>
+                <w:tab w:val="left" w:pos="1791"/>
+              </w:tabs>
+              <w:rPr>
+                <w:rFonts w:ascii="Calibri" w:hAnsi="Calibri" w:cs="Calibri"/>
+                <w:sz w:val="20"/>
+                <w:szCs w:val="20"/>
+              </w:rPr>
+            </w:pPr>
+            <w:r>
+              <w:rPr>
+                <w:rFonts w:ascii="Calibri" w:hAnsi="Calibri" w:cs="Calibri"/>
+                <w:sz w:val="20"/>
+                <w:szCs w:val="20"/>
+              </w:rPr>
+              <w:t>No</w:t>
+            </w:r>
+          </w:p>
+        </w:tc>
+        <w:tc>
+          <w:tcPr>
+            <w:tcW w:w="2091" w:type="dxa"/>
+            <w:shd w:val="clear" w:color="auto" w:fill="EEF1F8"/>
+          </w:tcPr>
+          <w:p>
+            <w:pPr>
+              <w:tabs>
+                <w:tab w:val="left" w:pos="1791"/>
+              </w:tabs>
+              <w:rPr>
+                <w:rFonts w:ascii="Calibri" w:hAnsi="Calibri" w:cs="Calibri"/>
+                <w:sz w:val="20"/>
+                <w:szCs w:val="20"/>
+              </w:rPr>
+            </w:pPr>
+            <w:r>
+              <w:rPr>
+                <w:rFonts w:ascii="Calibri" w:hAnsi="Calibri" w:cs="Calibri"/>
+                <w:sz w:val="20"/>
+                <w:szCs w:val="20"/>
+              </w:rPr>
+              <w:t>No</w:t>
+            </w:r>
+          </w:p>
+        </w:tc>
+        <w:tc>
+          <w:tcPr>
+            <w:tcW w:w="2091" w:type="dxa"/>
+            <w:shd w:val="clear" w:color="auto" w:fill="EEF1F8"/>
+          </w:tcPr>
+          <w:p>
+            <w:pPr>
+              <w:tabs>
+                <w:tab w:val="left" w:pos="1791"/>
+              </w:tabs>
+              <w:rPr>
+                <w:rFonts w:ascii="Calibri" w:hAnsi="Calibri" w:cs="Calibri"/>
+                <w:sz w:val="20"/>
+                <w:szCs w:val="20"/>
+              </w:rPr>
+            </w:pPr>
+            <w:r>
+              <w:rPr>
+                <w:rFonts w:ascii="Calibri" w:hAnsi="Calibri" w:cs="Calibri"/>
+                <w:sz w:val="20"/>
+                <w:szCs w:val="20"/>
+              </w:rPr>
+              <w:t>Yes</w:t>
+            </w:r>
+          </w:p>
+        </w:tc>
+        <w:tc>
+          <w:tcPr>
+            <w:tcW w:w="2092" w:type="dxa"/>
+            <w:shd w:val="clear" w:color="auto" w:fill="EEF1F8"/>
+          </w:tcPr>
+          <w:p>
+            <w:pPr>
+              <w:tabs>
+                <w:tab w:val="left" w:pos="1791"/>
+              </w:tabs>
+              <w:rPr>
+                <w:rFonts w:ascii="Calibri" w:hAnsi="Calibri" w:cs="Calibri"/>
+                <w:sz w:val="20"/>
+                <w:szCs w:val="20"/>
+              </w:rPr>
+            </w:pPr>
+            <w:r>
+              <w:rPr>
+                <w:rFonts w:ascii="Calibri" w:hAnsi="Calibri" w:cs="Calibri"/>
+                <w:sz w:val="20"/>
+                <w:szCs w:val="20"/>
+              </w:rPr>
+              <w:t>Yes</w:t>
+            </w:r>
+          </w:p>
+        </w:tc>
+      </w:tr>
+      <w:tr>
+        <w:tc>
+          <w:tcPr>
+            <w:tcW w:w="2091" w:type="dxa"/>
+          </w:tcPr>
+          <w:p>
+            <w:pPr>
+              <w:tabs>
+                <w:tab w:val="left" w:pos="1791"/>
+              </w:tabs>
+              <w:rPr>
+                <w:rFonts w:ascii="Calibri" w:hAnsi="Calibri" w:cs="Calibri"/>
+                <w:sz w:val="20"/>
+                <w:szCs w:val="20"/>
+              </w:rPr>
+            </w:pPr>
+            <w:r>
+              <w:rPr>
+                <w:rFonts w:ascii="Calibri" w:hAnsi="Calibri" w:cs="Calibri"/>
+                <w:sz w:val="20"/>
+                <w:szCs w:val="20"/>
+              </w:rPr>
+              <w:t>Documentation gate sec.6</w:t>
+            </w:r>
+          </w:p>
+        </w:tc>
+        <w:tc>
+          <w:tcPr>
+            <w:tcW w:w="2091" w:type="dxa"/>
+          </w:tcPr>
+          <w:p>
+            <w:pPr>
+              <w:tabs>
+                <w:tab w:val="left" w:pos="1791"/>
+              </w:tabs>
+              <w:rPr>
+                <w:rFonts w:ascii="Calibri" w:hAnsi="Calibri" w:cs="Calibri"/>
+                <w:sz w:val="20"/>
+                <w:szCs w:val="20"/>
+              </w:rPr>
+            </w:pPr>
+            <w:r>
+              <w:rPr>
+                <w:rFonts w:ascii="Calibri" w:hAnsi="Calibri" w:cs="Calibri"/>
+                <w:sz w:val="20"/>
+                <w:szCs w:val="20"/>
+              </w:rPr>
+              <w:t>Optional</w:t>
+            </w:r>
+          </w:p>
+        </w:tc>
+        <w:tc>
+          <w:tcPr>
+            <w:tcW w:w="2091" w:type="dxa"/>
+          </w:tcPr>
+          <w:p>
+            <w:pPr>
+              <w:tabs>
+                <w:tab w:val="left" w:pos="1791"/>
+              </w:tabs>
+              <w:rPr>
+                <w:rFonts w:ascii="Calibri" w:hAnsi="Calibri" w:cs="Calibri"/>
+                <w:sz w:val="20"/>
+                <w:szCs w:val="20"/>
+              </w:rPr>
+            </w:pPr>
+            <w:r>
+              <w:rPr>
+                <w:rFonts w:ascii="Calibri" w:hAnsi="Calibri" w:cs="Calibri"/>
+                <w:sz w:val="20"/>
+                <w:szCs w:val="20"/>
+              </w:rPr>
+              <w:t>Yes (required)</w:t>
+            </w:r>
+          </w:p>
+        </w:tc>
+        <w:tc>
+          <w:tcPr>
+            <w:tcW w:w="2091" w:type="dxa"/>
+          </w:tcPr>
+          <w:p>
+            <w:pPr>
+              <w:tabs>
+                <w:tab w:val="left" w:pos="1791"/>
+              </w:tabs>
+              <w:rPr>
+                <w:rFonts w:ascii="Calibri" w:hAnsi="Calibri" w:cs="Calibri"/>
+                <w:sz w:val="20"/>
+                <w:szCs w:val="20"/>
+              </w:rPr>
+            </w:pPr>
+            <w:r>
+              <w:rPr>
+                <w:rFonts w:ascii="Calibri" w:hAnsi="Calibri" w:cs="Calibri"/>
+                <w:sz w:val="20"/>
+                <w:szCs w:val="20"/>
+              </w:rPr>
+              <w:t>No</w:t>
+            </w:r>
+          </w:p>
+        </w:tc>
+        <w:tc>
+          <w:tcPr>
+            <w:tcW w:w="2092" w:type="dxa"/>
+          </w:tcPr>
+          <w:p>
+            <w:pPr>
+              <w:tabs>
+                <w:tab w:val="left" w:pos="1791"/>
+              </w:tabs>
+              <w:rPr>
+                <w:rFonts w:ascii="Calibri" w:hAnsi="Calibri" w:cs="Calibri"/>
+                <w:sz w:val="20"/>
+                <w:szCs w:val="20"/>
+              </w:rPr>
+            </w:pPr>
+            <w:r>
+              <w:rPr>
+                <w:rFonts w:ascii="Calibri" w:hAnsi="Calibri" w:cs="Calibri"/>
+                <w:sz w:val="20"/>
+                <w:szCs w:val="20"/>
+              </w:rPr>
+              <w:t>No</w:t>
+            </w:r>
+          </w:p>
+        </w:tc>
+      </w:tr>
+      <w:tr>
+        <w:tc>
+          <w:tcPr>
+            <w:tcW w:w="2091" w:type="dxa"/>
+            <w:shd w:val="clear" w:color="auto" w:fill="EEF1F8"/>
+          </w:tcPr>
+          <w:p>
+            <w:pPr>
+              <w:tabs>
+                <w:tab w:val="left" w:pos="1791"/>
+              </w:tabs>
+              <w:rPr>
+                <w:rFonts w:ascii="Calibri" w:hAnsi="Calibri" w:cs="Calibri"/>
+                <w:sz w:val="20"/>
+                <w:szCs w:val="20"/>
+              </w:rPr>
+            </w:pPr>
+            <w:r>
+              <w:rPr>
+                <w:rFonts w:ascii="Calibri" w:hAnsi="Calibri" w:cs="Calibri"/>
+                <w:sz w:val="20"/>
+                <w:szCs w:val="20"/>
+              </w:rPr>
+              <w:t>Business UAT sec.7</w:t>
+            </w:r>
+          </w:p>
+        </w:tc>
+        <w:tc>
+          <w:tcPr>
+            <w:tcW w:w="2091" w:type="dxa"/>
+            <w:shd w:val="clear" w:color="auto" w:fill="EEF1F8"/>
+          </w:tcPr>
+          <w:p>
+            <w:pPr>
+              <w:tabs>
+                <w:tab w:val="left" w:pos="1791"/>
+              </w:tabs>
+              <w:rPr>
+                <w:rFonts w:ascii="Calibri" w:hAnsi="Calibri" w:cs="Calibri"/>
+                <w:sz w:val="20"/>
+                <w:szCs w:val="20"/>
+              </w:rPr>
+            </w:pPr>
+            <w:r>
+              <w:rPr>
+                <w:rFonts w:ascii="Calibri" w:hAnsi="Calibri" w:cs="Calibri"/>
+                <w:sz w:val="20"/>
+                <w:szCs w:val="20"/>
+              </w:rPr>
+              <w:t>No</w:t>
+            </w:r>
+          </w:p>
+        </w:tc>
+        <w:tc>
+          <w:tcPr>
+            <w:tcW w:w="2091" w:type="dxa"/>
+            <w:shd w:val="clear" w:color="auto" w:fill="EEF1F8"/>
+          </w:tcPr>
+          <w:p>
+            <w:pPr>
+              <w:tabs>
+                <w:tab w:val="left" w:pos="1791"/>
+              </w:tabs>
+              <w:rPr>
+                <w:rFonts w:ascii="Calibri" w:hAnsi="Calibri" w:cs="Calibri"/>
+                <w:sz w:val="20"/>
+                <w:szCs w:val="20"/>
+              </w:rPr>
+            </w:pPr>
+            <w:r>
+              <w:rPr>
+                <w:rFonts w:ascii="Calibri" w:hAnsi="Calibri" w:cs="Calibri"/>
+                <w:sz w:val="20"/>
+                <w:szCs w:val="20"/>
+              </w:rPr>
+              <w:t>No</w:t>
+            </w:r>
+          </w:p>
+        </w:tc>
+        <w:tc>
+          <w:tcPr>
+            <w:tcW w:w="2091" w:type="dxa"/>
+            <w:shd w:val="clear" w:color="auto" w:fill="EEF1F8"/>
+          </w:tcPr>
+          <w:p>
+            <w:pPr>
+              <w:tabs>
+                <w:tab w:val="left" w:pos="1791"/>
+              </w:tabs>
+              <w:rPr>
+                <w:rFonts w:ascii="Calibri" w:hAnsi="Calibri" w:cs="Calibri"/>
+                <w:sz w:val="20"/>
+                <w:szCs w:val="20"/>
+              </w:rPr>
+            </w:pPr>
+            <w:r>
+              <w:rPr>
+                <w:rFonts w:ascii="Calibri" w:hAnsi="Calibri" w:cs="Calibri"/>
+                <w:sz w:val="20"/>
+                <w:szCs w:val="20"/>
+              </w:rPr>
+              <w:t>Yes</w:t>
+            </w:r>
+          </w:p>
+        </w:tc>
+        <w:tc>
+          <w:tcPr>
+            <w:tcW w:w="2092" w:type="dxa"/>
+            <w:shd w:val="clear" w:color="auto" w:fill="EEF1F8"/>
+          </w:tcPr>
+          <w:p>
+            <w:pPr>
+              <w:tabs>
+                <w:tab w:val="left" w:pos="1791"/>
+              </w:tabs>
+              <w:rPr>
+                <w:rFonts w:ascii="Calibri" w:hAnsi="Calibri" w:cs="Calibri"/>
+                <w:sz w:val="20"/>
+                <w:szCs w:val="20"/>
+              </w:rPr>
+            </w:pPr>
+            <w:r>
+              <w:rPr>
+                <w:rFonts w:ascii="Calibri" w:hAnsi="Calibri" w:cs="Calibri"/>
+                <w:sz w:val="20"/>
+                <w:szCs w:val="20"/>
+              </w:rPr>
+              <w:t>No</w:t>
+            </w:r>
+          </w:p>
+        </w:tc>
+      </w:tr>
+    </w:tbl>
+    <w:p>
+      <w:pPr>
+        <w:tabs>
+          <w:tab w:val="left" w:pos="1791"/>
+        </w:tabs>
+        <w:rPr>
+          <w:rFonts w:ascii="Calibri" w:hAnsi="Calibri" w:cs="Calibri"/>
+        </w:rPr>
+      </w:pPr>
+    </w:p>
+    <w:p>
+      <w:pPr>
+        <w:tabs>
+          <w:tab w:val="left" w:pos="1791"/>
+        </w:tabs>
+        <w:rPr>
+          <w:rFonts w:ascii="Calibri" w:hAnsi="Calibri" w:cs="Calibri"/>
+        </w:rPr>
+      </w:pPr>
+      <w:r>
+        <w:rPr>
+          <w:rFonts w:ascii="Calibri" w:hAnsi="Calibri" w:cs="Calibri"/>
+        </w:rPr>
+        <w:t>Apart from the single proving run in a separate schema, planted defects never run outside dev, so the environment domain owners use stays trustworthy.</w:t>
+      </w:r>
+    </w:p>
+    <w:p>
+      <w:pPr>
+        <w:tabs>
+          <w:tab w:val="left" w:pos="1791"/>
+        </w:tabs>
+        <w:rPr>
+          <w:rFonts w:ascii="Calibri" w:hAnsi="Calibri" w:cs="Calibri"/>
+        </w:rPr>
+      </w:pPr>
+      <w:r>
+        <w:rPr>
+          <w:rFonts w:ascii="Calibri" w:hAnsi="Calibri" w:cs="Calibri"/>
+          <w:b/>
+          <w:bCs/>
+        </w:rPr>
+        <w:t>Unverified</w:t>
+      </w:r>
+      <w:r>
+        <w:rPr>
+          <w:rFonts w:ascii="Calibri" w:hAnsi="Calibri" w:cs="Calibri"/>
+        </w:rPr>
+        <w:t xml:space="preserve">. </w:t>
+      </w:r>
+      <w:r>
+        <w:rPr>
+          <w:rFonts w:ascii="Calibri" w:hAnsi="Calibri" w:cs="Calibri"/>
+        </w:rPr>
+        <w:t>Fabric-specific behaviour (assumptions register rows 4-9) and Fabric capacity cost are to be confirmed before the Test/UAT workspace is built.</w:t>
+      </w:r>
+    </w:p>
+    <w:p>
+      <w:pPr>
+        <w:tabs>
+          <w:tab w:val="left" w:pos="1791"/>
+        </w:tabs>
+        <w:rPr>
+          <w:rFonts w:ascii="Calibri" w:hAnsi="Calibri" w:cs="Calibri"/>
+        </w:rPr>
+      </w:pPr>
+      <w:r>
+        <w:rPr>
+          <w:rFonts w:ascii="Calibri" w:hAnsi="Calibri" w:cs="Calibri"/>
+          <w:i/>
+          <w:iCs/>
+        </w:rPr>
+        <w:t>Proving run.</w:t>
+      </w:r>
+      <w:r>
+        <w:rPr>
+          <w:rFonts w:ascii="Calibri" w:hAnsi="Calibri" w:cs="Calibri"/>
+        </w:rPr>
+        <w:t xml:space="preserve"> Before UAT opens, the Section 5 planted-defect tests run once on Fabric in a separate schema from the one domain owners use, proving the controls work on the production platform, not only on </w:t>
+      </w:r>
+      <w:proofErr w:type="spellStart"/>
+      <w:r>
+        <w:rPr>
+          <w:rFonts w:ascii="Calibri" w:hAnsi="Calibri" w:cs="Calibri"/>
+        </w:rPr>
+        <w:t>DuckDB</w:t>
+      </w:r>
+      <w:proofErr w:type="spellEnd"/>
+      <w:r>
+        <w:rPr>
+          <w:rFonts w:ascii="Calibri" w:hAnsi="Calibri" w:cs="Calibri"/>
+        </w:rPr>
+        <w:t>. A clean run (Section 5, case 6) follows to confirm no false alarms before owners are given access.</w:t>
+      </w:r>
     </w:p>
     <w:p>
       <w:pPr>
@@ -4159,13 +7190,7 @@
         <w:rPr>
           <w:rFonts w:ascii="Calibri" w:hAnsi="Calibri" w:cs="Calibri"/>
         </w:rPr>
-        <w:t xml:space="preserve">The </w:t>
-      </w:r>
-      <w:r>
-        <w:rPr>
-          <w:rFonts w:ascii="Calibri" w:hAnsi="Calibri" w:cs="Calibri"/>
-        </w:rPr>
-        <w:t>completion of MET-001 marks the end of Step 11 — Metadata Strategy. The following items carry forward:</w:t>
+        <w:t>The completion of TST-001 marks the end of Step 12’s design work. Step 12 itself closes only once the documentation gate has run as a required CI check (Section 6), since MET-001 commits to proving it in this step.</w:t>
       </w:r>
     </w:p>
     <w:p>
@@ -4200,8 +7225,7 @@
         <w:rPr>
           <w:rFonts w:ascii="Calibri" w:hAnsi="Calibri" w:cs="Calibri"/>
         </w:rPr>
-        <w:lastRenderedPageBreak/>
-        <w:t>Publish MET-001, update Notion step tracker and README Step 11 status.</w:t>
+        <w:t>CDO review of TST-001, then publish it and update the Notion tracker and README.</w:t>
       </w:r>
     </w:p>
     <w:p>
@@ -4219,45 +7243,32 @@
         <w:rPr>
           <w:rFonts w:ascii="Calibri" w:hAnsi="Calibri" w:cs="Calibri"/>
         </w:rPr>
-        <w:t>Run a CDO review pass (same format as PDD-001 and DID-001) before MET-001 is marked Approved.</w:t>
-      </w:r>
-    </w:p>
-    <w:p>
-      <w:pPr>
-        <w:rPr>
-          <w:rFonts w:ascii="Calibri" w:hAnsi="Calibri" w:cs="Calibri"/>
-        </w:rPr>
-      </w:pPr>
-      <w:r>
+        <w:t>Build the GitHub Actions workflow and branch protection, and run the Section 6 test cases.</w:t>
+      </w:r>
+    </w:p>
+    <w:p>
+      <w:pPr>
         <w:rPr>
           <w:rFonts w:ascii="Calibri" w:hAnsi="Calibri" w:cs="Calibri"/>
           <w:b/>
           <w:bCs/>
         </w:rPr>
-        <w:t>Step 12 — Testing Strategy:</w:t>
-      </w:r>
-      <w:r>
-        <w:rPr>
-          <w:rFonts w:ascii="Calibri" w:hAnsi="Calibri" w:cs="Calibri"/>
-        </w:rPr>
-        <w:t xml:space="preserve"> Define the platform's testing approach — building directly on Section 3's dbt test gates (FR-CCR-007) and Section 6's automated documentation gate, extending them into a full test plan covering unit, integration, and reconciliation testing across all six domains.</w:t>
-      </w:r>
-    </w:p>
-    <w:p>
-      <w:pPr>
+      </w:pPr>
+      <w:r>
         <w:rPr>
           <w:rFonts w:ascii="Calibri" w:hAnsi="Calibri" w:cs="Calibri"/>
           <w:b/>
           <w:bCs/>
         </w:rPr>
-      </w:pPr>
+        <w:t xml:space="preserve">Outstanding items </w:t>
+      </w:r>
       <w:r>
         <w:rPr>
           <w:rFonts w:ascii="Calibri" w:hAnsi="Calibri" w:cs="Calibri"/>
           <w:b/>
           <w:bCs/>
         </w:rPr>
-        <w:t>Outstanding items requiring resolution before build (Steps 13+):</w:t>
+        <w:t>before or during build:</w:t>
       </w:r>
     </w:p>
     <w:p>
@@ -4278,13 +7289,25 @@
           <w:b/>
           <w:bCs/>
         </w:rPr>
-        <w:t>Automated documentation-completeness gate</w:t>
-      </w:r>
-      <w:r>
-        <w:rPr>
-          <w:rFonts w:ascii="Calibri" w:hAnsi="Calibri" w:cs="Calibri"/>
-        </w:rPr>
-        <w:t xml:space="preserve"> (Section 6) — the dbt CI configuration that actually enforces this must be built and proven during Step 14, not just designed here.</w:t>
+        <w:t>Assumptions register:</w:t>
+      </w:r>
+      <w:r>
+        <w:rPr>
+          <w:rFonts w:ascii="Calibri" w:hAnsi="Calibri" w:cs="Calibri"/>
+        </w:rPr>
+        <w:t xml:space="preserve"> rows 4-9 and 12-1</w:t>
+      </w:r>
+      <w:r>
+        <w:rPr>
+          <w:rFonts w:ascii="Calibri" w:hAnsi="Calibri" w:cs="Calibri"/>
+        </w:rPr>
+        <w:t>4</w:t>
+      </w:r>
+      <w:r>
+        <w:rPr>
+          <w:rFonts w:ascii="Calibri" w:hAnsi="Calibri" w:cs="Calibri"/>
+        </w:rPr>
+        <w:t xml:space="preserve"> to be verified, mostly against Fabric. Corrections raised to affected documents as needed.</w:t>
       </w:r>
     </w:p>
     <w:p>
@@ -4305,13 +7328,13 @@
           <w:b/>
           <w:bCs/>
         </w:rPr>
-        <w:t>Quarterly documentation audit</w:t>
-      </w:r>
-      <w:r>
-        <w:rPr>
-          <w:rFonts w:ascii="Calibri" w:hAnsi="Calibri" w:cs="Calibri"/>
-        </w:rPr>
-        <w:t xml:space="preserve"> (Section 6) — schedule and format to be formally established once Step 14 build begins and there is real documentation to audit.</w:t>
+        <w:t>Synthetic data generator</w:t>
+      </w:r>
+      <w:r>
+        <w:rPr>
+          <w:rFonts w:ascii="Calibri" w:hAnsi="Calibri" w:cs="Calibri"/>
+        </w:rPr>
+        <w:t xml:space="preserve"> (Python), including the independent answer key Section 5 depends on.</w:t>
       </w:r>
     </w:p>
     <w:p>
@@ -4332,13 +7355,13 @@
           <w:b/>
           <w:bCs/>
         </w:rPr>
-        <w:t>POPIA sensitivity classification</w:t>
-      </w:r>
-      <w:r>
-        <w:rPr>
-          <w:rFonts w:ascii="Calibri" w:hAnsi="Calibri" w:cs="Calibri"/>
-        </w:rPr>
-        <w:t xml:space="preserve"> (Section 5) — must be applied per column during Step 14 build; tied to ADR-002 and ADR-007's outstanding sign-offs, since the classification scheme's real-world stakes depend on those approvals completing.</w:t>
+        <w:t>Reject table design</w:t>
+      </w:r>
+      <w:r>
+        <w:rPr>
+          <w:rFonts w:ascii="Calibri" w:hAnsi="Calibri" w:cs="Calibri"/>
+        </w:rPr>
+        <w:t xml:space="preserve"> for Bronze-to-Silver reconciliation (Step 14), and the production source-side control-total method per source (Step 13).</w:t>
       </w:r>
     </w:p>
     <w:p>
@@ -4359,31 +7382,13 @@
           <w:b/>
           <w:bCs/>
         </w:rPr>
-        <w:t xml:space="preserve">Enterprise data </w:t>
-      </w:r>
-      <w:proofErr w:type="spellStart"/>
-      <w:r>
-        <w:rPr>
-          <w:rFonts w:ascii="Calibri" w:hAnsi="Calibri" w:cs="Calibri"/>
-          <w:b/>
-          <w:bCs/>
-        </w:rPr>
-        <w:t>catalog</w:t>
-      </w:r>
-      <w:proofErr w:type="spellEnd"/>
-      <w:r>
-        <w:rPr>
-          <w:rFonts w:ascii="Calibri" w:hAnsi="Calibri" w:cs="Calibri"/>
-          <w:b/>
-          <w:bCs/>
-        </w:rPr>
-        <w:t xml:space="preserve"> evaluation</w:t>
-      </w:r>
-      <w:r>
-        <w:rPr>
-          <w:rFonts w:ascii="Calibri" w:hAnsi="Calibri" w:cs="Calibri"/>
-        </w:rPr>
-        <w:t xml:space="preserve"> (Section 4) — deferred; revisit only if the platform scales meaningfully beyond its current six domains.</w:t>
+        <w:t>Identity resolution case 5</w:t>
+      </w:r>
+      <w:r>
+        <w:rPr>
+          <w:rFonts w:ascii="Calibri" w:hAnsi="Calibri" w:cs="Calibri"/>
+        </w:rPr>
+        <w:t xml:space="preserve"> (conflicting ID numbers not merged): a proposed rule pending ADR-002 sign-off.</w:t>
       </w:r>
     </w:p>
     <w:p>
@@ -4404,30 +7409,68 @@
           <w:b/>
           <w:bCs/>
         </w:rPr>
-        <w:t>Carried forward from PDD-001 and DID-001:</w:t>
-      </w:r>
-      <w:r>
-        <w:rPr>
-          <w:rFonts w:ascii="Calibri" w:hAnsi="Calibri" w:cs="Calibri"/>
-        </w:rPr>
-        <w:t xml:space="preserve"> ADR-002/003/006/007 sign-offs remain in progress; FactContactHistory attempt-sequencing validation against real Marketing Cloud behaviour is still unresolved.</w:t>
-      </w:r>
-    </w:p>
-    <w:p>
-      <w:pPr>
+        <w:t>Test severity tiers:</w:t>
+      </w:r>
+      <w:r>
+        <w:rPr>
+          <w:rFonts w:ascii="Calibri" w:hAnsi="Calibri" w:cs="Calibri"/>
+        </w:rPr>
+        <w:t xml:space="preserve"> all tests halt in v1.0; a warn/error model is to be agreed with domain owners once real failure patterns appear.</w:t>
+      </w:r>
+    </w:p>
+    <w:p>
+      <w:pPr>
+        <w:pStyle w:val="ListParagraph"/>
+        <w:numPr>
+          <w:ilvl w:val="0"/>
+          <w:numId w:val="23"/>
+        </w:numPr>
         <w:rPr>
           <w:rFonts w:ascii="Calibri" w:hAnsi="Calibri" w:cs="Calibri"/>
           <w:lang w:val="en-US"/>
         </w:rPr>
       </w:pPr>
-    </w:p>
-    <w:p>
-      <w:pPr>
+      <w:r>
+        <w:rPr>
+          <w:rFonts w:ascii="Calibri" w:hAnsi="Calibri" w:cs="Calibri"/>
+          <w:b/>
+          <w:bCs/>
+        </w:rPr>
+        <w:t>Fabric capacity cost:</w:t>
+      </w:r>
+      <w:r>
+        <w:rPr>
+          <w:rFonts w:ascii="Calibri" w:hAnsi="Calibri" w:cs="Calibri"/>
+        </w:rPr>
+        <w:t xml:space="preserve"> to be confirmed before the Test/UAT workspace is built</w:t>
+      </w:r>
+    </w:p>
+    <w:p>
+      <w:pPr>
+        <w:pStyle w:val="ListParagraph"/>
+        <w:numPr>
+          <w:ilvl w:val="0"/>
+          <w:numId w:val="23"/>
+        </w:numPr>
         <w:rPr>
           <w:rFonts w:ascii="Calibri" w:hAnsi="Calibri" w:cs="Calibri"/>
           <w:lang w:val="en-US"/>
         </w:rPr>
       </w:pPr>
+      <w:r>
+        <w:rPr>
+          <w:rFonts w:ascii="Calibri" w:hAnsi="Calibri" w:cs="Calibri"/>
+          <w:b/>
+          <w:bCs/>
+        </w:rPr>
+        <w:t>Carried forward:</w:t>
+      </w:r>
+      <w:r>
+        <w:rPr>
+          <w:rFonts w:ascii="Calibri" w:hAnsi="Calibri" w:cs="Calibri"/>
+        </w:rPr>
+        <w:t xml:space="preserve"> ADR-002, 003, 006 and 007 sign-offs; FactContactHistory attempt-sequencing validation; DID-001 v1.1 CDO sign-off; MET-001 v1.1 wording correction; a short ADR recording why dbt was chosen over ADF data flows.</w:t>
+      </w:r>
     </w:p>
     <w:p>
       <w:pPr>
@@ -4463,9 +7506,6 @@
     </w:p>
     <w:p>
       <w:pPr>
-        <w:tabs>
-          <w:tab w:val="left" w:pos="1791"/>
-        </w:tabs>
         <w:rPr>
           <w:rFonts w:ascii="Calibri" w:hAnsi="Calibri" w:cs="Calibri"/>
           <w:lang w:val="en-US"/>
@@ -4474,9 +7514,6 @@
     </w:p>
     <w:p>
       <w:pPr>
-        <w:tabs>
-          <w:tab w:val="left" w:pos="1791"/>
-        </w:tabs>
         <w:rPr>
           <w:rFonts w:ascii="Calibri" w:hAnsi="Calibri" w:cs="Calibri"/>
           <w:lang w:val="en-US"/>
@@ -4485,64 +7522,6 @@
     </w:p>
     <w:p>
       <w:pPr>
-        <w:tabs>
-          <w:tab w:val="left" w:pos="1791"/>
-        </w:tabs>
-        <w:rPr>
-          <w:rFonts w:ascii="Calibri" w:hAnsi="Calibri" w:cs="Calibri"/>
-          <w:lang w:val="en-US"/>
-        </w:rPr>
-      </w:pPr>
-    </w:p>
-    <w:p>
-      <w:pPr>
-        <w:tabs>
-          <w:tab w:val="left" w:pos="1791"/>
-        </w:tabs>
-        <w:rPr>
-          <w:rFonts w:ascii="Calibri" w:hAnsi="Calibri" w:cs="Calibri"/>
-          <w:lang w:val="en-US"/>
-        </w:rPr>
-      </w:pPr>
-    </w:p>
-    <w:p>
-      <w:pPr>
-        <w:tabs>
-          <w:tab w:val="left" w:pos="1791"/>
-        </w:tabs>
-        <w:rPr>
-          <w:rFonts w:ascii="Calibri" w:hAnsi="Calibri" w:cs="Calibri"/>
-          <w:lang w:val="en-US"/>
-        </w:rPr>
-      </w:pPr>
-    </w:p>
-    <w:p>
-      <w:pPr>
-        <w:tabs>
-          <w:tab w:val="left" w:pos="1791"/>
-        </w:tabs>
-        <w:rPr>
-          <w:rFonts w:ascii="Calibri" w:hAnsi="Calibri" w:cs="Calibri"/>
-          <w:lang w:val="en-US"/>
-        </w:rPr>
-      </w:pPr>
-    </w:p>
-    <w:p>
-      <w:pPr>
-        <w:tabs>
-          <w:tab w:val="left" w:pos="1791"/>
-        </w:tabs>
-        <w:rPr>
-          <w:rFonts w:ascii="Calibri" w:hAnsi="Calibri" w:cs="Calibri"/>
-          <w:lang w:val="en-US"/>
-        </w:rPr>
-      </w:pPr>
-    </w:p>
-    <w:p>
-      <w:pPr>
-        <w:tabs>
-          <w:tab w:val="left" w:pos="1791"/>
-        </w:tabs>
         <w:rPr>
           <w:rFonts w:ascii="Calibri" w:hAnsi="Calibri" w:cs="Calibri"/>
           <w:lang w:val="en-US"/>
@@ -4773,7 +7752,6 @@
                 <w:sz w:val="20"/>
                 <w:szCs w:val="20"/>
               </w:rPr>
-              <w:lastRenderedPageBreak/>
               <w:t>1.0</w:t>
             </w:r>
             <w:r>
@@ -4808,7 +7786,7 @@
                 <w:sz w:val="20"/>
                 <w:szCs w:val="20"/>
               </w:rPr>
-              <w:t>16</w:t>
+              <w:t>22</w:t>
             </w:r>
             <w:r>
               <w:rPr>
@@ -4817,7 +7795,25 @@
                 <w:sz w:val="20"/>
                 <w:szCs w:val="20"/>
               </w:rPr>
-              <w:t xml:space="preserve"> September 2026</w:t>
+              <w:t xml:space="preserve"> </w:t>
+            </w:r>
+            <w:r>
+              <w:rPr>
+                <w:rFonts w:ascii="Calibri" w:hAnsi="Calibri" w:cs="Calibri"/>
+                <w:color w:val="166534"/>
+                <w:sz w:val="20"/>
+                <w:szCs w:val="20"/>
+              </w:rPr>
+              <w:t>October</w:t>
+            </w:r>
+            <w:r>
+              <w:rPr>
+                <w:rFonts w:ascii="Calibri" w:hAnsi="Calibri" w:cs="Calibri"/>
+                <w:color w:val="166534"/>
+                <w:sz w:val="20"/>
+                <w:szCs w:val="20"/>
+              </w:rPr>
+              <w:t xml:space="preserve"> 2026</w:t>
             </w:r>
           </w:p>
         </w:tc>
@@ -4885,47 +7881,7 @@
                 <w:sz w:val="20"/>
                 <w:szCs w:val="20"/>
               </w:rPr>
-              <w:t xml:space="preserve">Initial MET-001 draft. Defines lineage strategy (FR-CCR-001) built on </w:t>
-            </w:r>
-            <w:proofErr w:type="spellStart"/>
-            <w:r>
-              <w:rPr>
-                <w:rFonts w:ascii="Calibri" w:hAnsi="Calibri" w:cs="Calibri"/>
-                <w:color w:val="166534"/>
-                <w:sz w:val="20"/>
-                <w:szCs w:val="20"/>
-              </w:rPr>
-              <w:t>dbt's</w:t>
-            </w:r>
-            <w:proofErr w:type="spellEnd"/>
-            <w:r>
-              <w:rPr>
-                <w:rFonts w:ascii="Calibri" w:hAnsi="Calibri" w:cs="Calibri"/>
-                <w:color w:val="166534"/>
-                <w:sz w:val="20"/>
-                <w:szCs w:val="20"/>
-              </w:rPr>
-              <w:t xml:space="preserve"> native lineage graph with incremental documentation discipline; data dictionary approach using dbt docs for engineers and Power BI field descriptions for business stakeholders, avoiding a separate uncontracted data </w:t>
-            </w:r>
-            <w:proofErr w:type="spellStart"/>
-            <w:r>
-              <w:rPr>
-                <w:rFonts w:ascii="Calibri" w:hAnsi="Calibri" w:cs="Calibri"/>
-                <w:color w:val="166534"/>
-                <w:sz w:val="20"/>
-                <w:szCs w:val="20"/>
-              </w:rPr>
-              <w:t>catalog</w:t>
-            </w:r>
-            <w:proofErr w:type="spellEnd"/>
-            <w:r>
-              <w:rPr>
-                <w:rFonts w:ascii="Calibri" w:hAnsi="Calibri" w:cs="Calibri"/>
-                <w:color w:val="166534"/>
-                <w:sz w:val="20"/>
-                <w:szCs w:val="20"/>
-              </w:rPr>
-              <w:t xml:space="preserve"> tool; column-level documentation standard consolidating fields from DM-001, STM-001, and PDD-001 into one location, with a tiered POPIA sensitivity classification and a synthetic-data-only rule for sample values; governance model using an automated dbt build gate for documentation completeness (not manual enforcement), shared accountability between the Lead Data Engineer and domain owners, and a quarterly audit cadence to catch drift the automated gate cannot.</w:t>
+              <w:t>Initial TST-001 draft. Defines layered testing: Bronze arrival checks, Silver structural data tests, and Silver-to-Gold business-rule tests, all halting on failure in v1.0 (Section 3, Data Quality Testing). Adds targeted unit tests for logic that can be wrong yet look valid: identity resolution, SCD Type 2 configuration, duration calculations and contact counts (Section 4). Reconciliation testing proves controls catch planted defects across three legs, using a generator answer key (Section 5). Documentation gate testing defines eight planted cases with CI enforcement via branch protection (Section 6). Business UAT runs per domain with defined validators, rejection handling and dual sign-off for go-live (Section 7). Three environments plus CI, with a test-by-environment matrix (Section 8). Found and raised DID-001 v1.1 (reconciliation gap at Silver) and MET-001 v1.1 (gate wording).</w:t>
             </w:r>
           </w:p>
         </w:tc>
@@ -4952,7 +7908,7 @@
                 <w:sz w:val="20"/>
                 <w:szCs w:val="20"/>
               </w:rPr>
-              <w:t>1.0 – Approved</w:t>
+              <w:t>1.0 - Approved</w:t>
             </w:r>
           </w:p>
         </w:tc>
@@ -4977,7 +7933,7 @@
                 <w:sz w:val="20"/>
                 <w:szCs w:val="20"/>
               </w:rPr>
-              <w:t>16 September 2026</w:t>
+              <w:t>22 October 2026</w:t>
             </w:r>
           </w:p>
         </w:tc>
@@ -5027,8 +7983,9 @@
                 <w:sz w:val="20"/>
                 <w:szCs w:val="20"/>
               </w:rPr>
-              <w:t>Approved following review. Section 6 clarified: automated documentation gate confirmed tested and live from Step 1</w:t>
-            </w:r>
+              <w:t xml:space="preserve">Approved following review. Section 7: one owner per requirement, with FR-CCR-005 validated by Johan and the Lead Data Engineer excluded from validation to keep it independent of the build. Section 8: planted-defect proving run added in a separate Fabric schema before UAT opens, since controls proven on </w:t>
+            </w:r>
+            <w:proofErr w:type="spellStart"/>
             <w:r>
               <w:rPr>
                 <w:rFonts w:ascii="Calibri" w:hAnsi="Calibri" w:cs="Calibri"/>
@@ -5036,8 +7993,9 @@
                 <w:sz w:val="20"/>
                 <w:szCs w:val="20"/>
               </w:rPr>
-              <w:t>2</w:t>
-            </w:r>
+              <w:t>DuckDB</w:t>
+            </w:r>
+            <w:proofErr w:type="spellEnd"/>
             <w:r>
               <w:rPr>
                 <w:rFonts w:ascii="Calibri" w:hAnsi="Calibri" w:cs="Calibri"/>
@@ -5045,7 +8003,7 @@
                 <w:sz w:val="20"/>
                 <w:szCs w:val="20"/>
               </w:rPr>
-              <w:t>, before Step 14's first model is built — no backlog risk. Section 5: flagged a known limitation — the column-level POPIA sensitivity scheme cannot express risk arising from combinations of columns (e.g. segment + contact history); noted honestly as unsolved rather than removed or overstated.</w:t>
+              <w:t xml:space="preserve"> are not proven on Fabric.</w:t>
             </w:r>
           </w:p>
         </w:tc>
@@ -7720,6 +10678,119 @@
     </w:lvl>
   </w:abstractNum>
   <w:abstractNum w:abstractNumId="20" w15:restartNumberingAfterBreak="0">
+    <w:nsid w:val="5EEC5C9B"/>
+    <w:multiLevelType w:val="multilevel"/>
+    <w:tmpl w:val="C1CE85B0"/>
+    <w:lvl w:ilvl="0">
+      <w:start w:val="1"/>
+      <w:numFmt w:val="decimal"/>
+      <w:lvlText w:val="%1.0"/>
+      <w:lvlJc w:val="left"/>
+      <w:pPr>
+        <w:ind w:left="525" w:hanging="525"/>
+      </w:pPr>
+      <w:rPr>
+        <w:rFonts w:hint="default"/>
+      </w:rPr>
+    </w:lvl>
+    <w:lvl w:ilvl="1">
+      <w:start w:val="1"/>
+      <w:numFmt w:val="decimal"/>
+      <w:lvlText w:val="%1.%2"/>
+      <w:lvlJc w:val="left"/>
+      <w:pPr>
+        <w:ind w:left="1245" w:hanging="525"/>
+      </w:pPr>
+      <w:rPr>
+        <w:rFonts w:hint="default"/>
+      </w:rPr>
+    </w:lvl>
+    <w:lvl w:ilvl="2">
+      <w:start w:val="1"/>
+      <w:numFmt w:val="decimal"/>
+      <w:lvlText w:val="%1.%2.%3"/>
+      <w:lvlJc w:val="left"/>
+      <w:pPr>
+        <w:ind w:left="2160" w:hanging="720"/>
+      </w:pPr>
+      <w:rPr>
+        <w:rFonts w:hint="default"/>
+      </w:rPr>
+    </w:lvl>
+    <w:lvl w:ilvl="3">
+      <w:start w:val="1"/>
+      <w:numFmt w:val="decimal"/>
+      <w:lvlText w:val="%1.%2.%3.%4"/>
+      <w:lvlJc w:val="left"/>
+      <w:pPr>
+        <w:ind w:left="3240" w:hanging="1080"/>
+      </w:pPr>
+      <w:rPr>
+        <w:rFonts w:hint="default"/>
+      </w:rPr>
+    </w:lvl>
+    <w:lvl w:ilvl="4">
+      <w:start w:val="1"/>
+      <w:numFmt w:val="decimal"/>
+      <w:lvlText w:val="%1.%2.%3.%4.%5"/>
+      <w:lvlJc w:val="left"/>
+      <w:pPr>
+        <w:ind w:left="3960" w:hanging="1080"/>
+      </w:pPr>
+      <w:rPr>
+        <w:rFonts w:hint="default"/>
+      </w:rPr>
+    </w:lvl>
+    <w:lvl w:ilvl="5">
+      <w:start w:val="1"/>
+      <w:numFmt w:val="decimal"/>
+      <w:lvlText w:val="%1.%2.%3.%4.%5.%6"/>
+      <w:lvlJc w:val="left"/>
+      <w:pPr>
+        <w:ind w:left="5040" w:hanging="1440"/>
+      </w:pPr>
+      <w:rPr>
+        <w:rFonts w:hint="default"/>
+      </w:rPr>
+    </w:lvl>
+    <w:lvl w:ilvl="6">
+      <w:start w:val="1"/>
+      <w:numFmt w:val="decimal"/>
+      <w:lvlText w:val="%1.%2.%3.%4.%5.%6.%7"/>
+      <w:lvlJc w:val="left"/>
+      <w:pPr>
+        <w:ind w:left="5760" w:hanging="1440"/>
+      </w:pPr>
+      <w:rPr>
+        <w:rFonts w:hint="default"/>
+      </w:rPr>
+    </w:lvl>
+    <w:lvl w:ilvl="7">
+      <w:start w:val="1"/>
+      <w:numFmt w:val="decimal"/>
+      <w:lvlText w:val="%1.%2.%3.%4.%5.%6.%7.%8"/>
+      <w:lvlJc w:val="left"/>
+      <w:pPr>
+        <w:ind w:left="6840" w:hanging="1800"/>
+      </w:pPr>
+      <w:rPr>
+        <w:rFonts w:hint="default"/>
+      </w:rPr>
+    </w:lvl>
+    <w:lvl w:ilvl="8">
+      <w:start w:val="1"/>
+      <w:numFmt w:val="decimal"/>
+      <w:lvlText w:val="%1.%2.%3.%4.%5.%6.%7.%8.%9"/>
+      <w:lvlJc w:val="left"/>
+      <w:pPr>
+        <w:ind w:left="7560" w:hanging="1800"/>
+      </w:pPr>
+      <w:rPr>
+        <w:rFonts w:hint="default"/>
+      </w:rPr>
+    </w:lvl>
+  </w:abstractNum>
+  <w:abstractNum w:abstractNumId="21" w15:restartNumberingAfterBreak="0">
     <w:nsid w:val="6312792D"/>
     <w:multiLevelType w:val="hybridMultilevel"/>
     <w:tmpl w:val="2F4CDA38"/>
@@ -7832,7 +10903,7 @@
       </w:rPr>
     </w:lvl>
   </w:abstractNum>
-  <w:abstractNum w:abstractNumId="21" w15:restartNumberingAfterBreak="0">
+  <w:abstractNum w:abstractNumId="22" w15:restartNumberingAfterBreak="0">
     <w:nsid w:val="65E53D3A"/>
     <w:multiLevelType w:val="hybridMultilevel"/>
     <w:tmpl w:val="FD8C6AE8"/>
@@ -7944,7 +11015,7 @@
       </w:rPr>
     </w:lvl>
   </w:abstractNum>
-  <w:abstractNum w:abstractNumId="22" w15:restartNumberingAfterBreak="0">
+  <w:abstractNum w:abstractNumId="23" w15:restartNumberingAfterBreak="0">
     <w:nsid w:val="6AD52F73"/>
     <w:multiLevelType w:val="hybridMultilevel"/>
     <w:tmpl w:val="0A886C40"/>
@@ -8030,7 +11101,7 @@
       </w:pPr>
     </w:lvl>
   </w:abstractNum>
-  <w:abstractNum w:abstractNumId="23" w15:restartNumberingAfterBreak="0">
+  <w:abstractNum w:abstractNumId="24" w15:restartNumberingAfterBreak="0">
     <w:nsid w:val="778D2E13"/>
     <w:multiLevelType w:val="hybridMultilevel"/>
     <w:tmpl w:val="86C0F51C"/>
@@ -8143,7 +11214,7 @@
       </w:rPr>
     </w:lvl>
   </w:abstractNum>
-  <w:abstractNum w:abstractNumId="24" w15:restartNumberingAfterBreak="0">
+  <w:abstractNum w:abstractNumId="25" w15:restartNumberingAfterBreak="0">
     <w:nsid w:val="7CE77FDA"/>
     <w:multiLevelType w:val="hybridMultilevel"/>
     <w:tmpl w:val="43E61A64"/>
@@ -8256,7 +11327,7 @@
       </w:rPr>
     </w:lvl>
   </w:abstractNum>
-  <w:abstractNum w:abstractNumId="25" w15:restartNumberingAfterBreak="0">
+  <w:abstractNum w:abstractNumId="26" w15:restartNumberingAfterBreak="0">
     <w:nsid w:val="7DAD2AEB"/>
     <w:multiLevelType w:val="hybridMultilevel"/>
     <w:tmpl w:val="7F046308"/>
@@ -8373,7 +11444,7 @@
     <w:abstractNumId w:val="17"/>
   </w:num>
   <w:num w:numId="2" w16cid:durableId="61801767">
-    <w:abstractNumId w:val="21"/>
+    <w:abstractNumId w:val="22"/>
   </w:num>
   <w:num w:numId="3" w16cid:durableId="261035166">
     <w:abstractNumId w:val="13"/>
@@ -8385,7 +11456,7 @@
     <w:abstractNumId w:val="6"/>
   </w:num>
   <w:num w:numId="6" w16cid:durableId="1358582591">
-    <w:abstractNumId w:val="22"/>
+    <w:abstractNumId w:val="23"/>
   </w:num>
   <w:num w:numId="7" w16cid:durableId="240414948">
     <w:abstractNumId w:val="14"/>
@@ -8400,7 +11471,7 @@
     <w:abstractNumId w:val="7"/>
   </w:num>
   <w:num w:numId="11" w16cid:durableId="1318807528">
-    <w:abstractNumId w:val="24"/>
+    <w:abstractNumId w:val="25"/>
   </w:num>
   <w:num w:numId="12" w16cid:durableId="2055885035">
     <w:abstractNumId w:val="3"/>
@@ -8415,7 +11486,7 @@
     <w:abstractNumId w:val="4"/>
   </w:num>
   <w:num w:numId="16" w16cid:durableId="129059050">
-    <w:abstractNumId w:val="25"/>
+    <w:abstractNumId w:val="26"/>
   </w:num>
   <w:num w:numId="17" w16cid:durableId="1435176202">
     <w:abstractNumId w:val="19"/>
@@ -8424,7 +11495,7 @@
     <w:abstractNumId w:val="18"/>
   </w:num>
   <w:num w:numId="19" w16cid:durableId="1355619352">
-    <w:abstractNumId w:val="23"/>
+    <w:abstractNumId w:val="24"/>
   </w:num>
   <w:num w:numId="20" w16cid:durableId="1043793170">
     <w:abstractNumId w:val="12"/>
@@ -8433,7 +11504,7 @@
     <w:abstractNumId w:val="8"/>
   </w:num>
   <w:num w:numId="22" w16cid:durableId="623271847">
-    <w:abstractNumId w:val="20"/>
+    <w:abstractNumId w:val="21"/>
   </w:num>
   <w:num w:numId="23" w16cid:durableId="1823766717">
     <w:abstractNumId w:val="10"/>
@@ -8446,6 +11517,9 @@
   </w:num>
   <w:num w:numId="26" w16cid:durableId="1661541835">
     <w:abstractNumId w:val="11"/>
+  </w:num>
+  <w:num w:numId="27" w16cid:durableId="718359046">
+    <w:abstractNumId w:val="20"/>
   </w:num>
 </w:numbering>
 </file>

</xml_diff>